<commit_message>
Set the checklist in IBM Plex Sans
</commit_message>
<xml_diff>
--- a/public/spin-go-checklist.docx
+++ b/public/spin-go-checklist.docx
@@ -5,78 +5,32 @@
   <w:body>
     <w:p>
       <w:pPr>
-        <w:spacing w:before="0" w:after="0" w:line="200" w:lineRule="auto"/>
+        <w:spacing w:before="0" w:after="0" w:line="220" w:lineRule="auto"/>
       </w:pPr>
       <w:r>
         <w:rPr>
-          <w:rFonts w:ascii="Neucha" w:hAnsi="Neucha" w:cs="Neucha" w:eastAsia="Neucha"/>
+          <w:rFonts w:ascii="IBM Plex Sans SemiBold" w:hAnsi="IBM Plex Sans SemiBold" w:cs="IBM Plex Sans SemiBold" w:eastAsia="IBM Plex Sans SemiBold"/>
           <w:b w:val="0"/>
           <w:i w:val="0"/>
           <w:color w:val="2A2622"/>
-          <w:sz w:val="64"/>
+          <w:sz w:val="56"/>
         </w:rPr>
         <w:t>Spin &amp; Go</w:t>
       </w:r>
     </w:p>
     <w:p>
       <w:pPr>
-        <w:spacing w:before="0" w:after="0" w:line="200" w:lineRule="auto"/>
+        <w:spacing w:before="0" w:after="40" w:line="240" w:lineRule="auto"/>
       </w:pPr>
       <w:r>
         <w:rPr>
-          <w:rFonts w:ascii="Neucha" w:hAnsi="Neucha" w:cs="Neucha" w:eastAsia="Neucha"/>
+          <w:rFonts w:ascii="IBM Plex Sans" w:hAnsi="IBM Plex Sans" w:cs="IBM Plex Sans" w:eastAsia="IBM Plex Sans"/>
           <w:b w:val="0"/>
           <w:i w:val="0"/>
           <w:color w:val="5C564E"/>
-          <w:sz w:val="32"/>
+          <w:sz w:val="24"/>
         </w:rPr>
-        <w:t>порядок раздачи  ·  3-max  ·  15bb</w:t>
-      </w:r>
-    </w:p>
-    <w:p>
-      <w:pPr>
-        <w:spacing w:before="0" w:after="20" w:line="80" w:lineRule="auto"/>
-      </w:pPr>
-      <w:r>
-        <w:rPr>
-          <w:rFonts w:ascii="Neucha" w:hAnsi="Neucha" w:cs="Neucha" w:eastAsia="Neucha"/>
-          <w:b w:val="0"/>
-          <w:i w:val="0"/>
-          <w:color w:val="2A2622"/>
-          <w:sz w:val="16"/>
-        </w:rPr>
-        <w:drawing>
-          <wp:inline xmlns:a="http://schemas.openxmlformats.org/drawingml/2006/main" xmlns:pic="http://schemas.openxmlformats.org/drawingml/2006/picture">
-            <wp:extent cx="6048000" cy="120960"/>
-            <wp:docPr id="1" name="Picture 1"/>
-            <wp:cNvGraphicFramePr>
-              <a:graphicFrameLocks noChangeAspect="1"/>
-            </wp:cNvGraphicFramePr>
-            <a:graphic>
-              <a:graphicData uri="http://schemas.openxmlformats.org/drawingml/2006/picture">
-                <pic:pic>
-                  <pic:nvPicPr>
-                    <pic:cNvPr id="0" name="image.png"/>
-                    <pic:cNvPicPr/>
-                  </pic:nvPicPr>
-                  <pic:blipFill>
-                    <a:blip r:embed="rId10"/>
-                    <a:stretch>
-                      <a:fillRect/>
-                    </a:stretch>
-                  </pic:blipFill>
-                  <pic:spPr>
-                    <a:xfrm>
-                      <a:off x="0" y="0"/>
-                      <a:ext cx="6048000" cy="120960"/>
-                    </a:xfrm>
-                    <a:prstGeom prst="rect"/>
-                  </pic:spPr>
-                </pic:pic>
-              </a:graphicData>
-            </a:graphic>
-          </wp:inline>
-        </w:drawing>
+        <w:t>Порядок раздачи  ·  3-max  ·  15bb</w:t>
       </w:r>
     </w:p>
     <w:tbl>
@@ -123,11 +77,11 @@
             </w:pPr>
             <w:r>
               <w:rPr>
-                <w:rFonts w:ascii="Neucha" w:hAnsi="Neucha" w:cs="Neucha" w:eastAsia="Neucha"/>
+                <w:rFonts w:ascii="IBM Plex Sans" w:hAnsi="IBM Plex Sans" w:cs="IBM Plex Sans" w:eastAsia="IBM Plex Sans"/>
                 <w:b w:val="0"/>
                 <w:i w:val="0"/>
                 <w:color w:val="B94A3E"/>
-                <w:sz w:val="25"/>
+                <w:sz w:val="24"/>
               </w:rPr>
               <w:t>Один вопрос за раз. Сначала спот, потом рука в чарте, потом действие. Эквити считаешь только когда впереди флоп или колл пуша. Калькулятор и солвер в раздаче не открывать: на большинстве сайтов это бан.</w:t>
             </w:r>
@@ -142,40 +96,40 @@
     </w:p>
     <w:p>
       <w:pPr>
-        <w:spacing w:before="40" w:after="16" w:line="226" w:lineRule="auto"/>
+        <w:spacing w:before="80" w:after="20" w:line="252" w:lineRule="auto"/>
       </w:pPr>
       <w:r>
         <w:rPr>
-          <w:rFonts w:ascii="Neucha" w:hAnsi="Neucha" w:cs="Neucha" w:eastAsia="Neucha"/>
+          <w:rFonts w:ascii="IBM Plex Sans SemiBold" w:hAnsi="IBM Plex Sans SemiBold" w:cs="IBM Plex Sans SemiBold" w:eastAsia="IBM Plex Sans SemiBold"/>
           <w:b w:val="0"/>
           <w:i w:val="0"/>
           <w:color w:val="B94A3E"/>
-          <w:sz w:val="32"/>
+          <w:sz w:val="28"/>
         </w:rPr>
         <w:t xml:space="preserve">1   </w:t>
       </w:r>
       <w:r>
         <w:rPr>
-          <w:rFonts w:ascii="Neucha" w:hAnsi="Neucha" w:cs="Neucha" w:eastAsia="Neucha"/>
+          <w:rFonts w:ascii="IBM Plex Sans SemiBold" w:hAnsi="IBM Plex Sans SemiBold" w:cs="IBM Plex Sans SemiBold" w:eastAsia="IBM Plex Sans SemiBold"/>
           <w:b w:val="0"/>
           <w:i w:val="0"/>
           <w:color w:val="2A2622"/>
-          <w:sz w:val="32"/>
+          <w:sz w:val="28"/>
         </w:rPr>
         <w:t>Позиция и стол</w:t>
       </w:r>
     </w:p>
     <w:p>
       <w:pPr>
-        <w:spacing w:before="0" w:after="40" w:line="226" w:lineRule="auto"/>
+        <w:spacing w:before="0" w:after="40" w:line="252" w:lineRule="auto"/>
       </w:pPr>
       <w:r>
         <w:rPr>
-          <w:rFonts w:ascii="Neucha" w:hAnsi="Neucha" w:cs="Neucha" w:eastAsia="Neucha"/>
+          <w:rFonts w:ascii="IBM Plex Sans" w:hAnsi="IBM Plex Sans" w:cs="IBM Plex Sans" w:eastAsia="IBM Plex Sans"/>
           <w:b w:val="0"/>
           <w:i w:val="0"/>
           <w:color w:val="2A2622"/>
-          <w:sz w:val="28"/>
+          <w:sz w:val="24"/>
         </w:rPr>
         <w:t>Кто ещё в банке: трое или уже двое. Ты BTN, SB или BB. Стек на старте 15bb. Если у кого-то меньше — решай по меньшему.</w:t>
       </w:r>
@@ -219,11 +173,11 @@
             </w:pPr>
             <w:r>
               <w:rPr>
-                <w:rFonts w:ascii="Neucha" w:hAnsi="Neucha" w:cs="Neucha" w:eastAsia="Neucha"/>
+                <w:rFonts w:ascii="IBM Plex Sans SemiBold" w:hAnsi="IBM Plex Sans SemiBold" w:cs="IBM Plex Sans SemiBold" w:eastAsia="IBM Plex Sans SemiBold"/>
                 <w:b w:val="0"/>
                 <w:i w:val="0"/>
                 <w:color w:val="1E4D7B"/>
-                <w:sz w:val="24"/>
+                <w:sz w:val="22"/>
               </w:rPr>
               <w:t>BTN</w:t>
             </w:r>
@@ -245,11 +199,11 @@
             </w:pPr>
             <w:r>
               <w:rPr>
-                <w:rFonts w:ascii="Neucha" w:hAnsi="Neucha" w:cs="Neucha" w:eastAsia="Neucha"/>
+                <w:rFonts w:ascii="IBM Plex Sans" w:hAnsi="IBM Plex Sans" w:cs="IBM Plex Sans" w:eastAsia="IBM Plex Sans"/>
                 <w:b w:val="0"/>
                 <w:i w:val="0"/>
                 <w:color w:val="2A2622"/>
-                <w:sz w:val="24"/>
+                <w:sz w:val="22"/>
               </w:rPr>
               <w:t>Ходишь первым, если никто не входил. Лимпа нет.</w:t>
             </w:r>
@@ -277,11 +231,11 @@
             </w:pPr>
             <w:r>
               <w:rPr>
-                <w:rFonts w:ascii="Neucha" w:hAnsi="Neucha" w:cs="Neucha" w:eastAsia="Neucha"/>
+                <w:rFonts w:ascii="IBM Plex Sans SemiBold" w:hAnsi="IBM Plex Sans SemiBold" w:cs="IBM Plex Sans SemiBold" w:eastAsia="IBM Plex Sans SemiBold"/>
                 <w:b w:val="0"/>
                 <w:i w:val="0"/>
                 <w:color w:val="1E4D7B"/>
-                <w:sz w:val="24"/>
+                <w:sz w:val="22"/>
               </w:rPr>
               <w:t>SB</w:t>
             </w:r>
@@ -303,11 +257,11 @@
             </w:pPr>
             <w:r>
               <w:rPr>
-                <w:rFonts w:ascii="Neucha" w:hAnsi="Neucha" w:cs="Neucha" w:eastAsia="Neucha"/>
+                <w:rFonts w:ascii="IBM Plex Sans" w:hAnsi="IBM Plex Sans" w:cs="IBM Plex Sans" w:eastAsia="IBM Plex Sans"/>
                 <w:b w:val="0"/>
                 <w:i w:val="0"/>
                 <w:color w:val="2A2622"/>
-                <w:sz w:val="24"/>
+                <w:sz w:val="22"/>
               </w:rPr>
               <w:t>BTN уже сказал слово. За тобой ещё отвечает BB.</w:t>
             </w:r>
@@ -335,11 +289,11 @@
             </w:pPr>
             <w:r>
               <w:rPr>
-                <w:rFonts w:ascii="Neucha" w:hAnsi="Neucha" w:cs="Neucha" w:eastAsia="Neucha"/>
+                <w:rFonts w:ascii="IBM Plex Sans SemiBold" w:hAnsi="IBM Plex Sans SemiBold" w:cs="IBM Plex Sans SemiBold" w:eastAsia="IBM Plex Sans SemiBold"/>
                 <w:b w:val="0"/>
                 <w:i w:val="0"/>
                 <w:color w:val="1E4D7B"/>
-                <w:sz w:val="24"/>
+                <w:sz w:val="22"/>
               </w:rPr>
               <w:t>BB</w:t>
             </w:r>
@@ -361,11 +315,11 @@
             </w:pPr>
             <w:r>
               <w:rPr>
-                <w:rFonts w:ascii="Neucha" w:hAnsi="Neucha" w:cs="Neucha" w:eastAsia="Neucha"/>
+                <w:rFonts w:ascii="IBM Plex Sans" w:hAnsi="IBM Plex Sans" w:cs="IBM Plex Sans" w:eastAsia="IBM Plex Sans"/>
                 <w:b w:val="0"/>
                 <w:i w:val="0"/>
                 <w:color w:val="2A2622"/>
-                <w:sz w:val="24"/>
+                <w:sz w:val="22"/>
               </w:rPr>
               <w:t>Закрываешь круг. Часто остаёшься один на один.</w:t>
             </w:r>
@@ -393,11 +347,11 @@
             </w:pPr>
             <w:r>
               <w:rPr>
-                <w:rFonts w:ascii="Neucha" w:hAnsi="Neucha" w:cs="Neucha" w:eastAsia="Neucha"/>
+                <w:rFonts w:ascii="IBM Plex Sans SemiBold" w:hAnsi="IBM Plex Sans SemiBold" w:cs="IBM Plex Sans SemiBold" w:eastAsia="IBM Plex Sans SemiBold"/>
                 <w:b w:val="0"/>
                 <w:i w:val="0"/>
                 <w:color w:val="1E4D7B"/>
-                <w:sz w:val="24"/>
+                <w:sz w:val="22"/>
               </w:rPr>
               <w:t>Heads-up</w:t>
             </w:r>
@@ -419,11 +373,11 @@
             </w:pPr>
             <w:r>
               <w:rPr>
-                <w:rFonts w:ascii="Neucha" w:hAnsi="Neucha" w:cs="Neucha" w:eastAsia="Neucha"/>
+                <w:rFonts w:ascii="IBM Plex Sans" w:hAnsi="IBM Plex Sans" w:cs="IBM Plex Sans" w:eastAsia="IBM Plex Sans"/>
                 <w:b w:val="0"/>
                 <w:i w:val="0"/>
                 <w:color w:val="2A2622"/>
-                <w:sz w:val="24"/>
+                <w:sz w:val="22"/>
               </w:rPr>
               <w:t>Остались двое. Чарты другие, не путай с игрой втроём.</w:t>
             </w:r>
@@ -438,40 +392,40 @@
     </w:p>
     <w:p>
       <w:pPr>
-        <w:spacing w:before="40" w:after="16" w:line="226" w:lineRule="auto"/>
+        <w:spacing w:before="80" w:after="20" w:line="252" w:lineRule="auto"/>
       </w:pPr>
       <w:r>
         <w:rPr>
-          <w:rFonts w:ascii="Neucha" w:hAnsi="Neucha" w:cs="Neucha" w:eastAsia="Neucha"/>
+          <w:rFonts w:ascii="IBM Plex Sans SemiBold" w:hAnsi="IBM Plex Sans SemiBold" w:cs="IBM Plex Sans SemiBold" w:eastAsia="IBM Plex Sans SemiBold"/>
           <w:b w:val="0"/>
           <w:i w:val="0"/>
           <w:color w:val="B94A3E"/>
-          <w:sz w:val="32"/>
+          <w:sz w:val="28"/>
         </w:rPr>
         <w:t xml:space="preserve">2   </w:t>
       </w:r>
       <w:r>
         <w:rPr>
-          <w:rFonts w:ascii="Neucha" w:hAnsi="Neucha" w:cs="Neucha" w:eastAsia="Neucha"/>
+          <w:rFonts w:ascii="IBM Plex Sans SemiBold" w:hAnsi="IBM Plex Sans SemiBold" w:cs="IBM Plex Sans SemiBold" w:eastAsia="IBM Plex Sans SemiBold"/>
           <w:b w:val="0"/>
           <w:i w:val="0"/>
           <w:color w:val="2A2622"/>
-          <w:sz w:val="32"/>
+          <w:sz w:val="28"/>
         </w:rPr>
         <w:t>Сначала спот, потом рука</w:t>
       </w:r>
     </w:p>
     <w:p>
       <w:pPr>
-        <w:spacing w:before="0" w:after="40" w:line="226" w:lineRule="auto"/>
+        <w:spacing w:before="0" w:after="40" w:line="252" w:lineRule="auto"/>
       </w:pPr>
       <w:r>
         <w:rPr>
-          <w:rFonts w:ascii="Neucha" w:hAnsi="Neucha" w:cs="Neucha" w:eastAsia="Neucha"/>
+          <w:rFonts w:ascii="IBM Plex Sans" w:hAnsi="IBM Plex Sans" w:cs="IBM Plex Sans" w:eastAsia="IBM Plex Sans"/>
           <w:b w:val="0"/>
           <w:i w:val="0"/>
           <w:color w:val="2A2622"/>
-          <w:sz w:val="28"/>
+          <w:sz w:val="24"/>
         </w:rPr>
         <w:t>Не начинай с эквити. Сначала: что уже сделали. Потом открой этот чарт. Рука — клетка в нём. Префлоп тебе не нужна «сила руки на глаз», нужна буква клетки: пара, туз, одномасть или нет.</w:t>
       </w:r>
@@ -515,11 +469,11 @@
             </w:pPr>
             <w:r>
               <w:rPr>
-                <w:rFonts w:ascii="Neucha" w:hAnsi="Neucha" w:cs="Neucha" w:eastAsia="Neucha"/>
+                <w:rFonts w:ascii="IBM Plex Sans SemiBold" w:hAnsi="IBM Plex Sans SemiBold" w:cs="IBM Plex Sans SemiBold" w:eastAsia="IBM Plex Sans SemiBold"/>
                 <w:b w:val="0"/>
                 <w:i w:val="0"/>
                 <w:color w:val="1E4D7B"/>
-                <w:sz w:val="24"/>
+                <w:sz w:val="22"/>
               </w:rPr>
               <w:t>Никто не открыл</w:t>
             </w:r>
@@ -541,11 +495,11 @@
             </w:pPr>
             <w:r>
               <w:rPr>
-                <w:rFonts w:ascii="Neucha" w:hAnsi="Neucha" w:cs="Neucha" w:eastAsia="Neucha"/>
+                <w:rFonts w:ascii="IBM Plex Sans" w:hAnsi="IBM Plex Sans" w:cs="IBM Plex Sans" w:eastAsia="IBM Plex Sans"/>
                 <w:b w:val="0"/>
                 <w:i w:val="0"/>
                 <w:color w:val="2A2622"/>
-                <w:sz w:val="24"/>
+                <w:sz w:val="22"/>
               </w:rPr>
               <w:t>Чарт открытия твоей позиции.</w:t>
             </w:r>
@@ -573,11 +527,11 @@
             </w:pPr>
             <w:r>
               <w:rPr>
-                <w:rFonts w:ascii="Neucha" w:hAnsi="Neucha" w:cs="Neucha" w:eastAsia="Neucha"/>
+                <w:rFonts w:ascii="IBM Plex Sans SemiBold" w:hAnsi="IBM Plex Sans SemiBold" w:cs="IBM Plex Sans SemiBold" w:eastAsia="IBM Plex Sans SemiBold"/>
                 <w:b w:val="0"/>
                 <w:i w:val="0"/>
                 <w:color w:val="1E4D7B"/>
-                <w:sz w:val="24"/>
+                <w:sz w:val="22"/>
               </w:rPr>
               <w:t>Был рейз</w:t>
             </w:r>
@@ -599,11 +553,11 @@
             </w:pPr>
             <w:r>
               <w:rPr>
-                <w:rFonts w:ascii="Neucha" w:hAnsi="Neucha" w:cs="Neucha" w:eastAsia="Neucha"/>
+                <w:rFonts w:ascii="IBM Plex Sans" w:hAnsi="IBM Plex Sans" w:cs="IBM Plex Sans" w:eastAsia="IBM Plex Sans"/>
                 <w:b w:val="0"/>
                 <w:i w:val="0"/>
                 <w:color w:val="2A2622"/>
-                <w:sz w:val="24"/>
+                <w:sz w:val="22"/>
               </w:rPr>
               <w:t>Чарт защиты против этого рейза.</w:t>
             </w:r>
@@ -631,11 +585,11 @@
             </w:pPr>
             <w:r>
               <w:rPr>
-                <w:rFonts w:ascii="Neucha" w:hAnsi="Neucha" w:cs="Neucha" w:eastAsia="Neucha"/>
+                <w:rFonts w:ascii="IBM Plex Sans SemiBold" w:hAnsi="IBM Plex Sans SemiBold" w:cs="IBM Plex Sans SemiBold" w:eastAsia="IBM Plex Sans SemiBold"/>
                 <w:b w:val="0"/>
                 <w:i w:val="0"/>
                 <w:color w:val="1E4D7B"/>
-                <w:sz w:val="24"/>
+                <w:sz w:val="22"/>
               </w:rPr>
               <w:t>Был 3-бет, не олл-ин</w:t>
             </w:r>
@@ -657,11 +611,11 @@
             </w:pPr>
             <w:r>
               <w:rPr>
-                <w:rFonts w:ascii="Neucha" w:hAnsi="Neucha" w:cs="Neucha" w:eastAsia="Neucha"/>
+                <w:rFonts w:ascii="IBM Plex Sans" w:hAnsi="IBM Plex Sans" w:cs="IBM Plex Sans" w:eastAsia="IBM Plex Sans"/>
                 <w:b w:val="0"/>
                 <w:i w:val="0"/>
                 <w:color w:val="2A2622"/>
-                <w:sz w:val="24"/>
+                <w:sz w:val="22"/>
               </w:rPr>
               <w:t>Фолд, колл или пуш. Другой чарт.</w:t>
             </w:r>
@@ -689,11 +643,11 @@
             </w:pPr>
             <w:r>
               <w:rPr>
-                <w:rFonts w:ascii="Neucha" w:hAnsi="Neucha" w:cs="Neucha" w:eastAsia="Neucha"/>
+                <w:rFonts w:ascii="IBM Plex Sans SemiBold" w:hAnsi="IBM Plex Sans SemiBold" w:cs="IBM Plex Sans SemiBold" w:eastAsia="IBM Plex Sans SemiBold"/>
                 <w:b w:val="0"/>
                 <w:i w:val="0"/>
                 <w:color w:val="1E4D7B"/>
-                <w:sz w:val="24"/>
+                <w:sz w:val="22"/>
               </w:rPr>
               <w:t>Был пуш</w:t>
             </w:r>
@@ -715,11 +669,11 @@
             </w:pPr>
             <w:r>
               <w:rPr>
-                <w:rFonts w:ascii="Neucha" w:hAnsi="Neucha" w:cs="Neucha" w:eastAsia="Neucha"/>
+                <w:rFonts w:ascii="IBM Plex Sans" w:hAnsi="IBM Plex Sans" w:cs="IBM Plex Sans" w:eastAsia="IBM Plex Sans"/>
                 <w:b w:val="0"/>
                 <w:i w:val="0"/>
                 <w:color w:val="2A2622"/>
-                <w:sz w:val="24"/>
+                <w:sz w:val="22"/>
               </w:rPr>
               <w:t>Только фолд или колл. Эквити против его диапазона.</w:t>
             </w:r>
@@ -734,40 +688,40 @@
     </w:p>
     <w:p>
       <w:pPr>
-        <w:spacing w:before="40" w:after="16" w:line="226" w:lineRule="auto"/>
+        <w:spacing w:before="80" w:after="20" w:line="252" w:lineRule="auto"/>
       </w:pPr>
       <w:r>
         <w:rPr>
-          <w:rFonts w:ascii="Neucha" w:hAnsi="Neucha" w:cs="Neucha" w:eastAsia="Neucha"/>
+          <w:rFonts w:ascii="IBM Plex Sans SemiBold" w:hAnsi="IBM Plex Sans SemiBold" w:cs="IBM Plex Sans SemiBold" w:eastAsia="IBM Plex Sans SemiBold"/>
           <w:b w:val="0"/>
           <w:i w:val="0"/>
           <w:color w:val="B94A3E"/>
-          <w:sz w:val="32"/>
+          <w:sz w:val="28"/>
         </w:rPr>
         <w:t xml:space="preserve">3   </w:t>
       </w:r>
       <w:r>
         <w:rPr>
-          <w:rFonts w:ascii="Neucha" w:hAnsi="Neucha" w:cs="Neucha" w:eastAsia="Neucha"/>
+          <w:rFonts w:ascii="IBM Plex Sans SemiBold" w:hAnsi="IBM Plex Sans SemiBold" w:cs="IBM Plex Sans SemiBold" w:eastAsia="IBM Plex Sans SemiBold"/>
           <w:b w:val="0"/>
           <w:i w:val="0"/>
           <w:color w:val="2A2622"/>
-          <w:sz w:val="32"/>
+          <w:sz w:val="28"/>
         </w:rPr>
         <w:t>Размер не выдумывается</w:t>
       </w:r>
     </w:p>
     <w:p>
       <w:pPr>
-        <w:spacing w:before="0" w:after="40" w:line="226" w:lineRule="auto"/>
+        <w:spacing w:before="0" w:after="40" w:line="252" w:lineRule="auto"/>
       </w:pPr>
       <w:r>
         <w:rPr>
-          <w:rFonts w:ascii="Neucha" w:hAnsi="Neucha" w:cs="Neucha" w:eastAsia="Neucha"/>
+          <w:rFonts w:ascii="IBM Plex Sans" w:hAnsi="IBM Plex Sans" w:cs="IBM Plex Sans" w:eastAsia="IBM Plex Sans"/>
           <w:b w:val="0"/>
           <w:i w:val="0"/>
           <w:color w:val="2A2622"/>
-          <w:sz w:val="28"/>
+          <w:sz w:val="24"/>
         </w:rPr>
         <w:t>На 15bb сайзинг уже в чарте. Микс — бери частое действие. Не ставь «чтобы посмотреть флоп».</w:t>
       </w:r>
@@ -811,11 +765,11 @@
             </w:pPr>
             <w:r>
               <w:rPr>
-                <w:rFonts w:ascii="Neucha" w:hAnsi="Neucha" w:cs="Neucha" w:eastAsia="Neucha"/>
+                <w:rFonts w:ascii="IBM Plex Sans SemiBold" w:hAnsi="IBM Plex Sans SemiBold" w:cs="IBM Plex Sans SemiBold" w:eastAsia="IBM Plex Sans SemiBold"/>
                 <w:b w:val="0"/>
                 <w:i w:val="0"/>
                 <w:color w:val="1E4D7B"/>
-                <w:sz w:val="24"/>
+                <w:sz w:val="22"/>
               </w:rPr>
               <w:t>BTN открыл</w:t>
             </w:r>
@@ -837,11 +791,11 @@
             </w:pPr>
             <w:r>
               <w:rPr>
-                <w:rFonts w:ascii="Neucha" w:hAnsi="Neucha" w:cs="Neucha" w:eastAsia="Neucha"/>
+                <w:rFonts w:ascii="IBM Plex Sans" w:hAnsi="IBM Plex Sans" w:cs="IBM Plex Sans" w:eastAsia="IBM Plex Sans"/>
                 <w:b w:val="0"/>
                 <w:i w:val="0"/>
                 <w:color w:val="2A2622"/>
-                <w:sz w:val="24"/>
+                <w:sz w:val="22"/>
               </w:rPr>
               <w:t>2bb, или пуш 15bb, или фолд.</w:t>
             </w:r>
@@ -869,11 +823,11 @@
             </w:pPr>
             <w:r>
               <w:rPr>
-                <w:rFonts w:ascii="Neucha" w:hAnsi="Neucha" w:cs="Neucha" w:eastAsia="Neucha"/>
+                <w:rFonts w:ascii="IBM Plex Sans SemiBold" w:hAnsi="IBM Plex Sans SemiBold" w:cs="IBM Plex Sans SemiBold" w:eastAsia="IBM Plex Sans SemiBold"/>
                 <w:b w:val="0"/>
                 <w:i w:val="0"/>
                 <w:color w:val="1E4D7B"/>
-                <w:sz w:val="24"/>
+                <w:sz w:val="22"/>
               </w:rPr>
               <w:t>SB открыл</w:t>
             </w:r>
@@ -895,11 +849,11 @@
             </w:pPr>
             <w:r>
               <w:rPr>
-                <w:rFonts w:ascii="Neucha" w:hAnsi="Neucha" w:cs="Neucha" w:eastAsia="Neucha"/>
+                <w:rFonts w:ascii="IBM Plex Sans" w:hAnsi="IBM Plex Sans" w:cs="IBM Plex Sans" w:eastAsia="IBM Plex Sans"/>
                 <w:b w:val="0"/>
                 <w:i w:val="0"/>
                 <w:color w:val="2A2622"/>
-                <w:sz w:val="24"/>
+                <w:sz w:val="22"/>
               </w:rPr>
               <w:t>лимп, 2.5bb, пуш или фолд — как в чарте.</w:t>
             </w:r>
@@ -927,11 +881,11 @@
             </w:pPr>
             <w:r>
               <w:rPr>
-                <w:rFonts w:ascii="Neucha" w:hAnsi="Neucha" w:cs="Neucha" w:eastAsia="Neucha"/>
+                <w:rFonts w:ascii="IBM Plex Sans SemiBold" w:hAnsi="IBM Plex Sans SemiBold" w:cs="IBM Plex Sans SemiBold" w:eastAsia="IBM Plex Sans SemiBold"/>
                 <w:b w:val="0"/>
                 <w:i w:val="0"/>
                 <w:color w:val="1E4D7B"/>
-                <w:sz w:val="24"/>
+                <w:sz w:val="22"/>
               </w:rPr>
               <w:t>3-бет против одного</w:t>
             </w:r>
@@ -953,11 +907,11 @@
             </w:pPr>
             <w:r>
               <w:rPr>
-                <w:rFonts w:ascii="Neucha" w:hAnsi="Neucha" w:cs="Neucha" w:eastAsia="Neucha"/>
+                <w:rFonts w:ascii="IBM Plex Sans" w:hAnsi="IBM Plex Sans" w:cs="IBM Plex Sans" w:eastAsia="IBM Plex Sans"/>
                 <w:b w:val="0"/>
                 <w:i w:val="0"/>
                 <w:color w:val="2A2622"/>
-                <w:sz w:val="24"/>
+                <w:sz w:val="22"/>
               </w:rPr>
               <w:t>SB против BTN около 4bb. BB против рейза около 6bb. Иначе пуш.</w:t>
             </w:r>
@@ -985,11 +939,11 @@
             </w:pPr>
             <w:r>
               <w:rPr>
-                <w:rFonts w:ascii="Neucha" w:hAnsi="Neucha" w:cs="Neucha" w:eastAsia="Neucha"/>
+                <w:rFonts w:ascii="IBM Plex Sans SemiBold" w:hAnsi="IBM Plex Sans SemiBold" w:cs="IBM Plex Sans SemiBold" w:eastAsia="IBM Plex Sans SemiBold"/>
                 <w:b w:val="0"/>
                 <w:i w:val="0"/>
                 <w:color w:val="1E4D7B"/>
-                <w:sz w:val="24"/>
+                <w:sz w:val="22"/>
               </w:rPr>
               <w:t>Двое уже в банке</w:t>
             </w:r>
@@ -1011,11 +965,11 @@
             </w:pPr>
             <w:r>
               <w:rPr>
-                <w:rFonts w:ascii="Neucha" w:hAnsi="Neucha" w:cs="Neucha" w:eastAsia="Neucha"/>
+                <w:rFonts w:ascii="IBM Plex Sans" w:hAnsi="IBM Plex Sans" w:cs="IBM Plex Sans" w:eastAsia="IBM Plex Sans"/>
                 <w:b w:val="0"/>
                 <w:i w:val="0"/>
                 <w:color w:val="2A2622"/>
-                <w:sz w:val="24"/>
+                <w:sz w:val="22"/>
               </w:rPr>
               <w:t>Сквиз около 8bb или пуш. Это не игра один на один.</w:t>
             </w:r>
@@ -1043,11 +997,11 @@
             </w:pPr>
             <w:r>
               <w:rPr>
-                <w:rFonts w:ascii="Neucha" w:hAnsi="Neucha" w:cs="Neucha" w:eastAsia="Neucha"/>
+                <w:rFonts w:ascii="IBM Plex Sans SemiBold" w:hAnsi="IBM Plex Sans SemiBold" w:cs="IBM Plex Sans SemiBold" w:eastAsia="IBM Plex Sans SemiBold"/>
                 <w:b w:val="0"/>
                 <w:i w:val="0"/>
                 <w:color w:val="1E4D7B"/>
-                <w:sz w:val="24"/>
+                <w:sz w:val="22"/>
               </w:rPr>
               <w:t>Тебе пуш</w:t>
             </w:r>
@@ -1069,11 +1023,11 @@
             </w:pPr>
             <w:r>
               <w:rPr>
-                <w:rFonts w:ascii="Neucha" w:hAnsi="Neucha" w:cs="Neucha" w:eastAsia="Neucha"/>
+                <w:rFonts w:ascii="IBM Plex Sans" w:hAnsi="IBM Plex Sans" w:cs="IBM Plex Sans" w:eastAsia="IBM Plex Sans"/>
                 <w:b w:val="0"/>
                 <w:i w:val="0"/>
                 <w:color w:val="2A2622"/>
-                <w:sz w:val="24"/>
+                <w:sz w:val="22"/>
               </w:rPr>
               <w:t>Сайзинга нет. Только колл или фолд.</w:t>
             </w:r>
@@ -1130,11 +1084,11 @@
             </w:pPr>
             <w:r>
               <w:rPr>
-                <w:rFonts w:ascii="Neucha" w:hAnsi="Neucha" w:cs="Neucha" w:eastAsia="Neucha"/>
+                <w:rFonts w:ascii="IBM Plex Sans" w:hAnsi="IBM Plex Sans" w:cs="IBM Plex Sans" w:eastAsia="IBM Plex Sans"/>
                 <w:b w:val="0"/>
                 <w:i w:val="0"/>
                 <w:color w:val="2F6B4A"/>
-                <w:sz w:val="25"/>
+                <w:sz w:val="24"/>
               </w:rPr>
               <w:t>Колл пуша 15bb просит около 47%. Колл: AA–JJ, AK, AQ, AJ и любая пара. Фолд: ATo, KQo, 76s и слабее. Это якорь, если чарт не перед глазами.</w:t>
             </w:r>
@@ -1149,40 +1103,40 @@
     </w:p>
     <w:p>
       <w:pPr>
-        <w:spacing w:before="40" w:after="16" w:line="226" w:lineRule="auto"/>
+        <w:spacing w:before="80" w:after="20" w:line="252" w:lineRule="auto"/>
       </w:pPr>
       <w:r>
         <w:rPr>
-          <w:rFonts w:ascii="Neucha" w:hAnsi="Neucha" w:cs="Neucha" w:eastAsia="Neucha"/>
+          <w:rFonts w:ascii="IBM Plex Sans SemiBold" w:hAnsi="IBM Plex Sans SemiBold" w:cs="IBM Plex Sans SemiBold" w:eastAsia="IBM Plex Sans SemiBold"/>
           <w:b w:val="0"/>
           <w:i w:val="0"/>
           <w:color w:val="B94A3E"/>
-          <w:sz w:val="32"/>
+          <w:sz w:val="28"/>
         </w:rPr>
         <w:t xml:space="preserve">4   </w:t>
       </w:r>
       <w:r>
         <w:rPr>
-          <w:rFonts w:ascii="Neucha" w:hAnsi="Neucha" w:cs="Neucha" w:eastAsia="Neucha"/>
+          <w:rFonts w:ascii="IBM Plex Sans SemiBold" w:hAnsi="IBM Plex Sans SemiBold" w:cs="IBM Plex Sans SemiBold" w:eastAsia="IBM Plex Sans SemiBold"/>
           <w:b w:val="0"/>
           <w:i w:val="0"/>
           <w:color w:val="2A2622"/>
-          <w:sz w:val="32"/>
+          <w:sz w:val="28"/>
         </w:rPr>
         <w:t>Ответ соперника — новый спот</w:t>
       </w:r>
     </w:p>
     <w:p>
       <w:pPr>
-        <w:spacing w:before="0" w:after="40" w:line="226" w:lineRule="auto"/>
+        <w:spacing w:before="0" w:after="40" w:line="252" w:lineRule="auto"/>
       </w:pPr>
       <w:r>
         <w:rPr>
-          <w:rFonts w:ascii="Neucha" w:hAnsi="Neucha" w:cs="Neucha" w:eastAsia="Neucha"/>
+          <w:rFonts w:ascii="IBM Plex Sans" w:hAnsi="IBM Plex Sans" w:cs="IBM Plex Sans" w:eastAsia="IBM Plex Sans"/>
           <w:b w:val="0"/>
           <w:i w:val="0"/>
           <w:color w:val="2A2622"/>
-          <w:sz w:val="28"/>
+          <w:sz w:val="24"/>
         </w:rPr>
         <w:t>После своего действия смотри только ответ. Не додумывай «что он думает» глубже, чем название спота.</w:t>
       </w:r>
@@ -1226,11 +1180,11 @@
             </w:pPr>
             <w:r>
               <w:rPr>
-                <w:rFonts w:ascii="Neucha" w:hAnsi="Neucha" w:cs="Neucha" w:eastAsia="Neucha"/>
+                <w:rFonts w:ascii="IBM Plex Sans SemiBold" w:hAnsi="IBM Plex Sans SemiBold" w:cs="IBM Plex Sans SemiBold" w:eastAsia="IBM Plex Sans SemiBold"/>
                 <w:b w:val="0"/>
                 <w:i w:val="0"/>
                 <w:color w:val="1E4D7B"/>
-                <w:sz w:val="24"/>
+                <w:sz w:val="22"/>
               </w:rPr>
               <w:t>Фолд</w:t>
             </w:r>
@@ -1252,11 +1206,11 @@
             </w:pPr>
             <w:r>
               <w:rPr>
-                <w:rFonts w:ascii="Neucha" w:hAnsi="Neucha" w:cs="Neucha" w:eastAsia="Neucha"/>
+                <w:rFonts w:ascii="IBM Plex Sans" w:hAnsi="IBM Plex Sans" w:cs="IBM Plex Sans" w:eastAsia="IBM Plex Sans"/>
                 <w:b w:val="0"/>
                 <w:i w:val="0"/>
                 <w:color w:val="2A2622"/>
-                <w:sz w:val="24"/>
+                <w:sz w:val="22"/>
               </w:rPr>
               <w:t>Банк твой или ходит следующий. Раздача для тебя здесь может кончиться.</w:t>
             </w:r>
@@ -1284,11 +1238,11 @@
             </w:pPr>
             <w:r>
               <w:rPr>
-                <w:rFonts w:ascii="Neucha" w:hAnsi="Neucha" w:cs="Neucha" w:eastAsia="Neucha"/>
+                <w:rFonts w:ascii="IBM Plex Sans SemiBold" w:hAnsi="IBM Plex Sans SemiBold" w:cs="IBM Plex Sans SemiBold" w:eastAsia="IBM Plex Sans SemiBold"/>
                 <w:b w:val="0"/>
                 <w:i w:val="0"/>
                 <w:color w:val="1E4D7B"/>
-                <w:sz w:val="24"/>
+                <w:sz w:val="22"/>
               </w:rPr>
               <w:t>Колл, не пуш</w:t>
             </w:r>
@@ -1310,11 +1264,11 @@
             </w:pPr>
             <w:r>
               <w:rPr>
-                <w:rFonts w:ascii="Neucha" w:hAnsi="Neucha" w:cs="Neucha" w:eastAsia="Neucha"/>
+                <w:rFonts w:ascii="IBM Plex Sans" w:hAnsi="IBM Plex Sans" w:cs="IBM Plex Sans" w:eastAsia="IBM Plex Sans"/>
                 <w:b w:val="0"/>
                 <w:i w:val="0"/>
                 <w:color w:val="2A2622"/>
-                <w:sz w:val="24"/>
+                <w:sz w:val="22"/>
               </w:rPr>
               <w:t>Будет флоп. Запомни: один соперник или двое. Шаг 5.</w:t>
             </w:r>
@@ -1342,11 +1296,11 @@
             </w:pPr>
             <w:r>
               <w:rPr>
-                <w:rFonts w:ascii="Neucha" w:hAnsi="Neucha" w:cs="Neucha" w:eastAsia="Neucha"/>
+                <w:rFonts w:ascii="IBM Plex Sans SemiBold" w:hAnsi="IBM Plex Sans SemiBold" w:cs="IBM Plex Sans SemiBold" w:eastAsia="IBM Plex Sans SemiBold"/>
                 <w:b w:val="0"/>
                 <w:i w:val="0"/>
                 <w:color w:val="1E4D7B"/>
-                <w:sz w:val="24"/>
+                <w:sz w:val="22"/>
               </w:rPr>
               <w:t>Рейз не олл-ин</w:t>
             </w:r>
@@ -1368,11 +1322,11 @@
             </w:pPr>
             <w:r>
               <w:rPr>
-                <w:rFonts w:ascii="Neucha" w:hAnsi="Neucha" w:cs="Neucha" w:eastAsia="Neucha"/>
+                <w:rFonts w:ascii="IBM Plex Sans" w:hAnsi="IBM Plex Sans" w:cs="IBM Plex Sans" w:eastAsia="IBM Plex Sans"/>
                 <w:b w:val="0"/>
                 <w:i w:val="0"/>
                 <w:color w:val="2A2622"/>
-                <w:sz w:val="24"/>
+                <w:sz w:val="22"/>
               </w:rPr>
               <w:t>Вернись к шагу 2. Это другой чарт.</w:t>
             </w:r>
@@ -1400,11 +1354,11 @@
             </w:pPr>
             <w:r>
               <w:rPr>
-                <w:rFonts w:ascii="Neucha" w:hAnsi="Neucha" w:cs="Neucha" w:eastAsia="Neucha"/>
+                <w:rFonts w:ascii="IBM Plex Sans SemiBold" w:hAnsi="IBM Plex Sans SemiBold" w:cs="IBM Plex Sans SemiBold" w:eastAsia="IBM Plex Sans SemiBold"/>
                 <w:b w:val="0"/>
                 <w:i w:val="0"/>
                 <w:color w:val="1E4D7B"/>
-                <w:sz w:val="24"/>
+                <w:sz w:val="22"/>
               </w:rPr>
               <w:t>Пуш</w:t>
             </w:r>
@@ -1426,11 +1380,11 @@
             </w:pPr>
             <w:r>
               <w:rPr>
-                <w:rFonts w:ascii="Neucha" w:hAnsi="Neucha" w:cs="Neucha" w:eastAsia="Neucha"/>
+                <w:rFonts w:ascii="IBM Plex Sans" w:hAnsi="IBM Plex Sans" w:cs="IBM Plex Sans" w:eastAsia="IBM Plex Sans"/>
                 <w:b w:val="0"/>
                 <w:i w:val="0"/>
                 <w:color w:val="2A2622"/>
-                <w:sz w:val="24"/>
+                <w:sz w:val="22"/>
               </w:rPr>
               <w:t>Снова только колл или фолд. Если колл — все фишки в банке, шаги 5–8 не существуют.</w:t>
             </w:r>
@@ -1450,70 +1404,70 @@
     </w:p>
     <w:p>
       <w:pPr>
-        <w:spacing w:before="0" w:after="0" w:line="226" w:lineRule="auto"/>
+        <w:spacing w:before="0" w:after="0" w:line="240" w:lineRule="auto"/>
       </w:pPr>
       <w:r>
         <w:rPr>
-          <w:rFonts w:ascii="Neucha" w:hAnsi="Neucha" w:cs="Neucha" w:eastAsia="Neucha"/>
+          <w:rFonts w:ascii="IBM Plex Sans SemiBold" w:hAnsi="IBM Plex Sans SemiBold" w:cs="IBM Plex Sans SemiBold" w:eastAsia="IBM Plex Sans SemiBold"/>
           <w:b w:val="0"/>
           <w:i w:val="0"/>
           <w:color w:val="2A2622"/>
-          <w:sz w:val="52"/>
+          <w:sz w:val="44"/>
         </w:rPr>
         <w:t>Флоп и дальше</w:t>
       </w:r>
     </w:p>
     <w:p>
       <w:pPr>
-        <w:spacing w:before="0" w:after="40" w:line="226" w:lineRule="auto"/>
+        <w:spacing w:before="0" w:after="40" w:line="252" w:lineRule="auto"/>
       </w:pPr>
       <w:r>
         <w:rPr>
-          <w:rFonts w:ascii="Neucha" w:hAnsi="Neucha" w:cs="Neucha" w:eastAsia="Neucha"/>
+          <w:rFonts w:ascii="IBM Plex Sans" w:hAnsi="IBM Plex Sans" w:cs="IBM Plex Sans" w:eastAsia="IBM Plex Sans"/>
           <w:b w:val="0"/>
           <w:i w:val="0"/>
           <w:color w:val="5C564E"/>
-          <w:sz w:val="26"/>
+          <w:sz w:val="24"/>
         </w:rPr>
         <w:t>Только если фишки ещё за спиной. Олл-ин префлоп здесь не разыгрывается.</w:t>
       </w:r>
     </w:p>
     <w:p>
       <w:pPr>
-        <w:spacing w:before="40" w:after="16" w:line="226" w:lineRule="auto"/>
+        <w:spacing w:before="80" w:after="20" w:line="252" w:lineRule="auto"/>
       </w:pPr>
       <w:r>
         <w:rPr>
-          <w:rFonts w:ascii="Neucha" w:hAnsi="Neucha" w:cs="Neucha" w:eastAsia="Neucha"/>
+          <w:rFonts w:ascii="IBM Plex Sans SemiBold" w:hAnsi="IBM Plex Sans SemiBold" w:cs="IBM Plex Sans SemiBold" w:eastAsia="IBM Plex Sans SemiBold"/>
           <w:b w:val="0"/>
           <w:i w:val="0"/>
           <w:color w:val="B94A3E"/>
-          <w:sz w:val="32"/>
+          <w:sz w:val="28"/>
         </w:rPr>
         <w:t xml:space="preserve">5   </w:t>
       </w:r>
       <w:r>
         <w:rPr>
-          <w:rFonts w:ascii="Neucha" w:hAnsi="Neucha" w:cs="Neucha" w:eastAsia="Neucha"/>
+          <w:rFonts w:ascii="IBM Plex Sans SemiBold" w:hAnsi="IBM Plex Sans SemiBold" w:cs="IBM Plex Sans SemiBold" w:eastAsia="IBM Plex Sans SemiBold"/>
           <w:b w:val="0"/>
           <w:i w:val="0"/>
           <w:color w:val="2A2622"/>
-          <w:sz w:val="32"/>
+          <w:sz w:val="28"/>
         </w:rPr>
         <w:t>Флоп: стол, стек, доска, класс руки</w:t>
       </w:r>
     </w:p>
     <w:p>
       <w:pPr>
-        <w:spacing w:before="0" w:after="40" w:line="226" w:lineRule="auto"/>
+        <w:spacing w:before="0" w:after="40" w:line="252" w:lineRule="auto"/>
       </w:pPr>
       <w:r>
         <w:rPr>
-          <w:rFonts w:ascii="Neucha" w:hAnsi="Neucha" w:cs="Neucha" w:eastAsia="Neucha"/>
+          <w:rFonts w:ascii="IBM Plex Sans" w:hAnsi="IBM Plex Sans" w:cs="IBM Plex Sans" w:eastAsia="IBM Plex Sans"/>
           <w:b w:val="0"/>
           <w:i w:val="0"/>
           <w:color w:val="2A2622"/>
-          <w:sz w:val="28"/>
+          <w:sz w:val="24"/>
         </w:rPr>
         <w:t>Четыре коротких ответа, до любой математики.</w:t>
       </w:r>
@@ -1557,11 +1511,11 @@
             </w:pPr>
             <w:r>
               <w:rPr>
-                <w:rFonts w:ascii="Neucha" w:hAnsi="Neucha" w:cs="Neucha" w:eastAsia="Neucha"/>
+                <w:rFonts w:ascii="IBM Plex Sans SemiBold" w:hAnsi="IBM Plex Sans SemiBold" w:cs="IBM Plex Sans SemiBold" w:eastAsia="IBM Plex Sans SemiBold"/>
                 <w:b w:val="0"/>
                 <w:i w:val="0"/>
                 <w:color w:val="1E4D7B"/>
-                <w:sz w:val="24"/>
+                <w:sz w:val="22"/>
               </w:rPr>
               <w:t>Кто остался</w:t>
             </w:r>
@@ -1583,11 +1537,11 @@
             </w:pPr>
             <w:r>
               <w:rPr>
-                <w:rFonts w:ascii="Neucha" w:hAnsi="Neucha" w:cs="Neucha" w:eastAsia="Neucha"/>
+                <w:rFonts w:ascii="IBM Plex Sans" w:hAnsi="IBM Plex Sans" w:cs="IBM Plex Sans" w:eastAsia="IBM Plex Sans"/>
                 <w:b w:val="0"/>
                 <w:i w:val="0"/>
                 <w:color w:val="2A2622"/>
-                <w:sz w:val="24"/>
+                <w:sz w:val="22"/>
               </w:rPr>
               <w:t>Один — можно играть дро и редкий блеф. Двое — не блефуй и не коллируй дро дорого.</w:t>
             </w:r>
@@ -1615,11 +1569,11 @@
             </w:pPr>
             <w:r>
               <w:rPr>
-                <w:rFonts w:ascii="Neucha" w:hAnsi="Neucha" w:cs="Neucha" w:eastAsia="Neucha"/>
+                <w:rFonts w:ascii="IBM Plex Sans SemiBold" w:hAnsi="IBM Plex Sans SemiBold" w:cs="IBM Plex Sans SemiBold" w:eastAsia="IBM Plex Sans SemiBold"/>
                 <w:b w:val="0"/>
                 <w:i w:val="0"/>
                 <w:color w:val="1E4D7B"/>
-                <w:sz w:val="24"/>
+                <w:sz w:val="22"/>
               </w:rPr>
               <w:t>SPR</w:t>
             </w:r>
@@ -1641,11 +1595,11 @@
             </w:pPr>
             <w:r>
               <w:rPr>
-                <w:rFonts w:ascii="Neucha" w:hAnsi="Neucha" w:cs="Neucha" w:eastAsia="Neucha"/>
+                <w:rFonts w:ascii="IBM Plex Sans" w:hAnsi="IBM Plex Sans" w:cs="IBM Plex Sans" w:eastAsia="IBM Plex Sans"/>
                 <w:b w:val="0"/>
                 <w:i w:val="0"/>
                 <w:color w:val="2A2622"/>
-                <w:sz w:val="24"/>
+                <w:sz w:val="22"/>
               </w:rPr>
               <w:t>Стек за спиной / банк. Около 1 и меньше: дальше только пуш или фолд, не мелкая ставка.</w:t>
             </w:r>
@@ -1673,11 +1627,11 @@
             </w:pPr>
             <w:r>
               <w:rPr>
-                <w:rFonts w:ascii="Neucha" w:hAnsi="Neucha" w:cs="Neucha" w:eastAsia="Neucha"/>
+                <w:rFonts w:ascii="IBM Plex Sans SemiBold" w:hAnsi="IBM Plex Sans SemiBold" w:cs="IBM Plex Sans SemiBold" w:eastAsia="IBM Plex Sans SemiBold"/>
                 <w:b w:val="0"/>
                 <w:i w:val="0"/>
                 <w:color w:val="1E4D7B"/>
-                <w:sz w:val="24"/>
+                <w:sz w:val="22"/>
               </w:rPr>
               <w:t>Доска</w:t>
             </w:r>
@@ -1699,11 +1653,11 @@
             </w:pPr>
             <w:r>
               <w:rPr>
-                <w:rFonts w:ascii="Neucha" w:hAnsi="Neucha" w:cs="Neucha" w:eastAsia="Neucha"/>
+                <w:rFonts w:ascii="IBM Plex Sans" w:hAnsi="IBM Plex Sans" w:cs="IBM Plex Sans" w:eastAsia="IBM Plex Sans"/>
                 <w:b w:val="0"/>
                 <w:i w:val="0"/>
                 <w:color w:val="2A2622"/>
-                <w:sz w:val="24"/>
+                <w:sz w:val="22"/>
               </w:rPr>
               <w:t>Сухая (K72 разномасть), связанная (JT9 или две одного масти), спаренная.</w:t>
             </w:r>
@@ -1731,11 +1685,11 @@
             </w:pPr>
             <w:r>
               <w:rPr>
-                <w:rFonts w:ascii="Neucha" w:hAnsi="Neucha" w:cs="Neucha" w:eastAsia="Neucha"/>
+                <w:rFonts w:ascii="IBM Plex Sans SemiBold" w:hAnsi="IBM Plex Sans SemiBold" w:cs="IBM Plex Sans SemiBold" w:eastAsia="IBM Plex Sans SemiBold"/>
                 <w:b w:val="0"/>
                 <w:i w:val="0"/>
                 <w:color w:val="1E4D7B"/>
-                <w:sz w:val="24"/>
+                <w:sz w:val="22"/>
               </w:rPr>
               <w:t>Класс руки</w:t>
             </w:r>
@@ -1757,11 +1711,11 @@
             </w:pPr>
             <w:r>
               <w:rPr>
-                <w:rFonts w:ascii="Neucha" w:hAnsi="Neucha" w:cs="Neucha" w:eastAsia="Neucha"/>
+                <w:rFonts w:ascii="IBM Plex Sans" w:hAnsi="IBM Plex Sans" w:cs="IBM Plex Sans" w:eastAsia="IBM Plex Sans"/>
                 <w:b w:val="0"/>
                 <w:i w:val="0"/>
                 <w:color w:val="2A2622"/>
-                <w:sz w:val="24"/>
+                <w:sz w:val="22"/>
               </w:rPr>
               <w:t>Монстр, топ-пара, слабая пара, дро или воздух. Одна фраза, не история.</w:t>
             </w:r>
@@ -1776,40 +1730,40 @@
     </w:p>
     <w:p>
       <w:pPr>
-        <w:spacing w:before="40" w:after="16" w:line="226" w:lineRule="auto"/>
+        <w:spacing w:before="80" w:after="20" w:line="252" w:lineRule="auto"/>
       </w:pPr>
       <w:r>
         <w:rPr>
-          <w:rFonts w:ascii="Neucha" w:hAnsi="Neucha" w:cs="Neucha" w:eastAsia="Neucha"/>
+          <w:rFonts w:ascii="IBM Plex Sans SemiBold" w:hAnsi="IBM Plex Sans SemiBold" w:cs="IBM Plex Sans SemiBold" w:eastAsia="IBM Plex Sans SemiBold"/>
           <w:b w:val="0"/>
           <w:i w:val="0"/>
           <w:color w:val="B94A3E"/>
-          <w:sz w:val="32"/>
+          <w:sz w:val="28"/>
         </w:rPr>
         <w:t xml:space="preserve">6   </w:t>
       </w:r>
       <w:r>
         <w:rPr>
-          <w:rFonts w:ascii="Neucha" w:hAnsi="Neucha" w:cs="Neucha" w:eastAsia="Neucha"/>
+          <w:rFonts w:ascii="IBM Plex Sans SemiBold" w:hAnsi="IBM Plex Sans SemiBold" w:cs="IBM Plex Sans SemiBold" w:eastAsia="IBM Plex Sans SemiBold"/>
           <w:b w:val="0"/>
           <w:i w:val="0"/>
           <w:color w:val="2A2622"/>
-          <w:sz w:val="32"/>
+          <w:sz w:val="28"/>
         </w:rPr>
         <w:t>Ауты, потом цена, потом решение</w:t>
       </w:r>
     </w:p>
     <w:p>
       <w:pPr>
-        <w:spacing w:before="0" w:after="40" w:line="226" w:lineRule="auto"/>
+        <w:spacing w:before="0" w:after="40" w:line="252" w:lineRule="auto"/>
       </w:pPr>
       <w:r>
         <w:rPr>
-          <w:rFonts w:ascii="Neucha" w:hAnsi="Neucha" w:cs="Neucha" w:eastAsia="Neucha"/>
+          <w:rFonts w:ascii="IBM Plex Sans" w:hAnsi="IBM Plex Sans" w:cs="IBM Plex Sans" w:eastAsia="IBM Plex Sans"/>
           <w:b w:val="0"/>
           <w:i w:val="0"/>
           <w:color w:val="2A2622"/>
-          <w:sz w:val="28"/>
+          <w:sz w:val="24"/>
         </w:rPr>
         <w:t>Сначала чистые ауты: карта, после которой ты чаще впереди. Грязный аут, который не бьёт готовую руку, не считай.</w:t>
       </w:r>
@@ -1853,11 +1807,11 @@
             </w:pPr>
             <w:r>
               <w:rPr>
-                <w:rFonts w:ascii="Neucha" w:hAnsi="Neucha" w:cs="Neucha" w:eastAsia="Neucha"/>
+                <w:rFonts w:ascii="IBM Plex Sans SemiBold" w:hAnsi="IBM Plex Sans SemiBold" w:cs="IBM Plex Sans SemiBold" w:eastAsia="IBM Plex Sans SemiBold"/>
                 <w:b w:val="0"/>
                 <w:i w:val="0"/>
                 <w:color w:val="1E4D7B"/>
-                <w:sz w:val="24"/>
+                <w:sz w:val="22"/>
               </w:rPr>
               <w:t>Флоп</w:t>
             </w:r>
@@ -1879,11 +1833,11 @@
             </w:pPr>
             <w:r>
               <w:rPr>
-                <w:rFonts w:ascii="Neucha" w:hAnsi="Neucha" w:cs="Neucha" w:eastAsia="Neucha"/>
+                <w:rFonts w:ascii="IBM Plex Sans" w:hAnsi="IBM Plex Sans" w:cs="IBM Plex Sans" w:eastAsia="IBM Plex Sans"/>
                 <w:b w:val="0"/>
                 <w:i w:val="0"/>
                 <w:color w:val="2A2622"/>
-                <w:sz w:val="24"/>
+                <w:sz w:val="22"/>
               </w:rPr>
               <w:t>ауты × 4</w:t>
             </w:r>
@@ -1911,11 +1865,11 @@
             </w:pPr>
             <w:r>
               <w:rPr>
-                <w:rFonts w:ascii="Neucha" w:hAnsi="Neucha" w:cs="Neucha" w:eastAsia="Neucha"/>
+                <w:rFonts w:ascii="IBM Plex Sans SemiBold" w:hAnsi="IBM Plex Sans SemiBold" w:cs="IBM Plex Sans SemiBold" w:eastAsia="IBM Plex Sans SemiBold"/>
                 <w:b w:val="0"/>
                 <w:i w:val="0"/>
                 <w:color w:val="1E4D7B"/>
-                <w:sz w:val="24"/>
+                <w:sz w:val="22"/>
               </w:rPr>
               <w:t>Тёрн</w:t>
             </w:r>
@@ -1937,11 +1891,11 @@
             </w:pPr>
             <w:r>
               <w:rPr>
-                <w:rFonts w:ascii="Neucha" w:hAnsi="Neucha" w:cs="Neucha" w:eastAsia="Neucha"/>
+                <w:rFonts w:ascii="IBM Plex Sans" w:hAnsi="IBM Plex Sans" w:cs="IBM Plex Sans" w:eastAsia="IBM Plex Sans"/>
                 <w:b w:val="0"/>
                 <w:i w:val="0"/>
                 <w:color w:val="2A2622"/>
-                <w:sz w:val="24"/>
+                <w:sz w:val="22"/>
               </w:rPr>
               <w:t>ауты × 2</w:t>
             </w:r>
@@ -1969,11 +1923,11 @@
             </w:pPr>
             <w:r>
               <w:rPr>
-                <w:rFonts w:ascii="Neucha" w:hAnsi="Neucha" w:cs="Neucha" w:eastAsia="Neucha"/>
+                <w:rFonts w:ascii="IBM Plex Sans SemiBold" w:hAnsi="IBM Plex Sans SemiBold" w:cs="IBM Plex Sans SemiBold" w:eastAsia="IBM Plex Sans SemiBold"/>
                 <w:b w:val="0"/>
                 <w:i w:val="0"/>
                 <w:color w:val="1E4D7B"/>
-                <w:sz w:val="24"/>
+                <w:sz w:val="22"/>
               </w:rPr>
               <w:t>Гатшот, 4</w:t>
             </w:r>
@@ -1995,11 +1949,11 @@
             </w:pPr>
             <w:r>
               <w:rPr>
-                <w:rFonts w:ascii="Neucha" w:hAnsi="Neucha" w:cs="Neucha" w:eastAsia="Neucha"/>
+                <w:rFonts w:ascii="IBM Plex Sans" w:hAnsi="IBM Plex Sans" w:cs="IBM Plex Sans" w:eastAsia="IBM Plex Sans"/>
                 <w:b w:val="0"/>
                 <w:i w:val="0"/>
                 <w:color w:val="2A2622"/>
-                <w:sz w:val="24"/>
+                <w:sz w:val="22"/>
               </w:rPr>
               <w:t>около 16%</w:t>
             </w:r>
@@ -2027,11 +1981,11 @@
             </w:pPr>
             <w:r>
               <w:rPr>
-                <w:rFonts w:ascii="Neucha" w:hAnsi="Neucha" w:cs="Neucha" w:eastAsia="Neucha"/>
+                <w:rFonts w:ascii="IBM Plex Sans SemiBold" w:hAnsi="IBM Plex Sans SemiBold" w:cs="IBM Plex Sans SemiBold" w:eastAsia="IBM Plex Sans SemiBold"/>
                 <w:b w:val="0"/>
                 <w:i w:val="0"/>
                 <w:color w:val="1E4D7B"/>
-                <w:sz w:val="24"/>
+                <w:sz w:val="22"/>
               </w:rPr>
               <w:t>Две оверкарты, 6</w:t>
             </w:r>
@@ -2053,11 +2007,11 @@
             </w:pPr>
             <w:r>
               <w:rPr>
-                <w:rFonts w:ascii="Neucha" w:hAnsi="Neucha" w:cs="Neucha" w:eastAsia="Neucha"/>
+                <w:rFonts w:ascii="IBM Plex Sans" w:hAnsi="IBM Plex Sans" w:cs="IBM Plex Sans" w:eastAsia="IBM Plex Sans"/>
                 <w:b w:val="0"/>
                 <w:i w:val="0"/>
                 <w:color w:val="2A2622"/>
-                <w:sz w:val="24"/>
+                <w:sz w:val="22"/>
               </w:rPr>
               <w:t>около 24%</w:t>
             </w:r>
@@ -2085,11 +2039,11 @@
             </w:pPr>
             <w:r>
               <w:rPr>
-                <w:rFonts w:ascii="Neucha" w:hAnsi="Neucha" w:cs="Neucha" w:eastAsia="Neucha"/>
+                <w:rFonts w:ascii="IBM Plex Sans SemiBold" w:hAnsi="IBM Plex Sans SemiBold" w:cs="IBM Plex Sans SemiBold" w:eastAsia="IBM Plex Sans SemiBold"/>
                 <w:b w:val="0"/>
                 <w:i w:val="0"/>
                 <w:color w:val="1E4D7B"/>
-                <w:sz w:val="24"/>
+                <w:sz w:val="22"/>
               </w:rPr>
               <w:t>Стрейт с двух сторон, 8</w:t>
             </w:r>
@@ -2111,11 +2065,11 @@
             </w:pPr>
             <w:r>
               <w:rPr>
-                <w:rFonts w:ascii="Neucha" w:hAnsi="Neucha" w:cs="Neucha" w:eastAsia="Neucha"/>
+                <w:rFonts w:ascii="IBM Plex Sans" w:hAnsi="IBM Plex Sans" w:cs="IBM Plex Sans" w:eastAsia="IBM Plex Sans"/>
                 <w:b w:val="0"/>
                 <w:i w:val="0"/>
                 <w:color w:val="2A2622"/>
-                <w:sz w:val="24"/>
+                <w:sz w:val="22"/>
               </w:rPr>
               <w:t>около 32%</w:t>
             </w:r>
@@ -2143,11 +2097,11 @@
             </w:pPr>
             <w:r>
               <w:rPr>
-                <w:rFonts w:ascii="Neucha" w:hAnsi="Neucha" w:cs="Neucha" w:eastAsia="Neucha"/>
+                <w:rFonts w:ascii="IBM Plex Sans SemiBold" w:hAnsi="IBM Plex Sans SemiBold" w:cs="IBM Plex Sans SemiBold" w:eastAsia="IBM Plex Sans SemiBold"/>
                 <w:b w:val="0"/>
                 <w:i w:val="0"/>
                 <w:color w:val="1E4D7B"/>
-                <w:sz w:val="24"/>
+                <w:sz w:val="22"/>
               </w:rPr>
               <w:t>Голый флеш, 9</w:t>
             </w:r>
@@ -2169,11 +2123,11 @@
             </w:pPr>
             <w:r>
               <w:rPr>
-                <w:rFonts w:ascii="Neucha" w:hAnsi="Neucha" w:cs="Neucha" w:eastAsia="Neucha"/>
+                <w:rFonts w:ascii="IBM Plex Sans" w:hAnsi="IBM Plex Sans" w:cs="IBM Plex Sans" w:eastAsia="IBM Plex Sans"/>
                 <w:b w:val="0"/>
                 <w:i w:val="0"/>
                 <w:color w:val="2A2622"/>
-                <w:sz w:val="24"/>
+                <w:sz w:val="22"/>
               </w:rPr>
               <w:t>около 36%. Флеш плюс оверкарта — уже около 45%.</w:t>
             </w:r>
@@ -2230,11 +2184,11 @@
             </w:pPr>
             <w:r>
               <w:rPr>
-                <w:rFonts w:ascii="Neucha" w:hAnsi="Neucha" w:cs="Neucha" w:eastAsia="Neucha"/>
+                <w:rFonts w:ascii="IBM Plex Sans" w:hAnsi="IBM Plex Sans" w:cs="IBM Plex Sans" w:eastAsia="IBM Plex Sans"/>
                 <w:b w:val="0"/>
                 <w:i w:val="0"/>
                 <w:color w:val="B94A3E"/>
-                <w:sz w:val="25"/>
+                <w:sz w:val="24"/>
               </w:rPr>
               <w:t>Цена колла = сколько доплатить / банк после твоего колла. Пример: доплатить 3bb, сейчас в банке 7bb, после колла будет 10bb. Цена 3/10 = 30%. Полка эквити явно выше — колл. Явно ниже — фолд. На границе и SPR низкий — пуш или фолд, не колл «посмотреть».</w:t>
             </w:r>
@@ -2249,11 +2203,11 @@
     </w:p>
     <w:p>
       <w:pPr>
-        <w:spacing w:before="0" w:after="40" w:line="226" w:lineRule="auto"/>
+        <w:spacing w:before="0" w:after="40" w:line="252" w:lineRule="auto"/>
       </w:pPr>
       <w:r>
         <w:rPr>
-          <w:rFonts w:ascii="Neucha" w:hAnsi="Neucha" w:cs="Neucha" w:eastAsia="Neucha"/>
+          <w:rFonts w:ascii="IBM Plex Sans" w:hAnsi="IBM Plex Sans" w:cs="IBM Plex Sans" w:eastAsia="IBM Plex Sans"/>
           <w:b w:val="0"/>
           <w:i w:val="0"/>
           <w:color w:val="5C564E"/>
@@ -2264,40 +2218,40 @@
     </w:p>
     <w:p>
       <w:pPr>
-        <w:spacing w:before="40" w:after="16" w:line="226" w:lineRule="auto"/>
+        <w:spacing w:before="80" w:after="20" w:line="252" w:lineRule="auto"/>
       </w:pPr>
       <w:r>
         <w:rPr>
-          <w:rFonts w:ascii="Neucha" w:hAnsi="Neucha" w:cs="Neucha" w:eastAsia="Neucha"/>
+          <w:rFonts w:ascii="IBM Plex Sans SemiBold" w:hAnsi="IBM Plex Sans SemiBold" w:cs="IBM Plex Sans SemiBold" w:eastAsia="IBM Plex Sans SemiBold"/>
           <w:b w:val="0"/>
           <w:i w:val="0"/>
           <w:color w:val="B94A3E"/>
-          <w:sz w:val="32"/>
+          <w:sz w:val="28"/>
         </w:rPr>
         <w:t xml:space="preserve">7   </w:t>
       </w:r>
       <w:r>
         <w:rPr>
-          <w:rFonts w:ascii="Neucha" w:hAnsi="Neucha" w:cs="Neucha" w:eastAsia="Neucha"/>
+          <w:rFonts w:ascii="IBM Plex Sans SemiBold" w:hAnsi="IBM Plex Sans SemiBold" w:cs="IBM Plex Sans SemiBold" w:eastAsia="IBM Plex Sans SemiBold"/>
           <w:b w:val="0"/>
           <w:i w:val="0"/>
           <w:color w:val="2A2622"/>
-          <w:sz w:val="32"/>
+          <w:sz w:val="28"/>
         </w:rPr>
         <w:t>Если ставишь ты — одна цель</w:t>
       </w:r>
     </w:p>
     <w:p>
       <w:pPr>
-        <w:spacing w:before="0" w:after="40" w:line="226" w:lineRule="auto"/>
+        <w:spacing w:before="0" w:after="40" w:line="252" w:lineRule="auto"/>
       </w:pPr>
       <w:r>
         <w:rPr>
-          <w:rFonts w:ascii="Neucha" w:hAnsi="Neucha" w:cs="Neucha" w:eastAsia="Neucha"/>
+          <w:rFonts w:ascii="IBM Plex Sans" w:hAnsi="IBM Plex Sans" w:cs="IBM Plex Sans" w:eastAsia="IBM Plex Sans"/>
           <w:b w:val="0"/>
           <w:i w:val="0"/>
           <w:color w:val="2A2622"/>
-          <w:sz w:val="28"/>
+          <w:sz w:val="24"/>
         </w:rPr>
         <w:t>Не «забрать банк и подстраховаться». Выбери одно. На 15bb вэлью чаще пуш, чем три улицы мелких ставок.</w:t>
       </w:r>
@@ -2341,11 +2295,11 @@
             </w:pPr>
             <w:r>
               <w:rPr>
-                <w:rFonts w:ascii="Neucha" w:hAnsi="Neucha" w:cs="Neucha" w:eastAsia="Neucha"/>
+                <w:rFonts w:ascii="IBM Plex Sans SemiBold" w:hAnsi="IBM Plex Sans SemiBold" w:cs="IBM Plex Sans SemiBold" w:eastAsia="IBM Plex Sans SemiBold"/>
                 <w:b w:val="0"/>
                 <w:i w:val="0"/>
                 <w:color w:val="1E4D7B"/>
-                <w:sz w:val="24"/>
+                <w:sz w:val="22"/>
               </w:rPr>
               <w:t>Вэлью</w:t>
             </w:r>
@@ -2367,11 +2321,11 @@
             </w:pPr>
             <w:r>
               <w:rPr>
-                <w:rFonts w:ascii="Neucha" w:hAnsi="Neucha" w:cs="Neucha" w:eastAsia="Neucha"/>
+                <w:rFonts w:ascii="IBM Plex Sans" w:hAnsi="IBM Plex Sans" w:cs="IBM Plex Sans" w:eastAsia="IBM Plex Sans"/>
                 <w:b w:val="0"/>
                 <w:i w:val="0"/>
                 <w:color w:val="2A2622"/>
-                <w:sz w:val="24"/>
+                <w:sz w:val="22"/>
               </w:rPr>
               <w:t>Рука впереди тех, кто заплатит. Ставишь, потому что хуже платят. Нет коллов хуже — нет вэлью.</w:t>
             </w:r>
@@ -2399,11 +2353,11 @@
             </w:pPr>
             <w:r>
               <w:rPr>
-                <w:rFonts w:ascii="Neucha" w:hAnsi="Neucha" w:cs="Neucha" w:eastAsia="Neucha"/>
+                <w:rFonts w:ascii="IBM Plex Sans SemiBold" w:hAnsi="IBM Plex Sans SemiBold" w:cs="IBM Plex Sans SemiBold" w:eastAsia="IBM Plex Sans SemiBold"/>
                 <w:b w:val="0"/>
                 <w:i w:val="0"/>
                 <w:color w:val="1E4D7B"/>
-                <w:sz w:val="24"/>
+                <w:sz w:val="22"/>
               </w:rPr>
               <w:t>Блеф</w:t>
             </w:r>
@@ -2425,11 +2379,11 @@
             </w:pPr>
             <w:r>
               <w:rPr>
-                <w:rFonts w:ascii="Neucha" w:hAnsi="Neucha" w:cs="Neucha" w:eastAsia="Neucha"/>
+                <w:rFonts w:ascii="IBM Plex Sans" w:hAnsi="IBM Plex Sans" w:cs="IBM Plex Sans" w:eastAsia="IBM Plex Sans"/>
                 <w:b w:val="0"/>
                 <w:i w:val="0"/>
                 <w:color w:val="2A2622"/>
-                <w:sz w:val="24"/>
+                <w:sz w:val="22"/>
               </w:rPr>
               <w:t>Лучше тебя слишком много, и часть этих рук сбросит. Нет фолда — блеф мёртвый. Дро может быть ставкой, если ауты оплачивают пуш.</w:t>
             </w:r>
@@ -2457,11 +2411,11 @@
             </w:pPr>
             <w:r>
               <w:rPr>
-                <w:rFonts w:ascii="Neucha" w:hAnsi="Neucha" w:cs="Neucha" w:eastAsia="Neucha"/>
+                <w:rFonts w:ascii="IBM Plex Sans SemiBold" w:hAnsi="IBM Plex Sans SemiBold" w:cs="IBM Plex Sans SemiBold" w:eastAsia="IBM Plex Sans SemiBold"/>
                 <w:b w:val="0"/>
                 <w:i w:val="0"/>
                 <w:color w:val="1E4D7B"/>
-                <w:sz w:val="24"/>
+                <w:sz w:val="22"/>
               </w:rPr>
               <w:t>Ни того ни другого</w:t>
             </w:r>
@@ -2483,11 +2437,11 @@
             </w:pPr>
             <w:r>
               <w:rPr>
-                <w:rFonts w:ascii="Neucha" w:hAnsi="Neucha" w:cs="Neucha" w:eastAsia="Neucha"/>
+                <w:rFonts w:ascii="IBM Plex Sans" w:hAnsi="IBM Plex Sans" w:cs="IBM Plex Sans" w:eastAsia="IBM Plex Sans"/>
                 <w:b w:val="0"/>
                 <w:i w:val="0"/>
                 <w:color w:val="2A2622"/>
-                <w:sz w:val="24"/>
+                <w:sz w:val="22"/>
               </w:rPr>
               <w:t>Чек. Не ставь «на всякий случай».</w:t>
             </w:r>
@@ -2515,11 +2469,11 @@
             </w:pPr>
             <w:r>
               <w:rPr>
-                <w:rFonts w:ascii="Neucha" w:hAnsi="Neucha" w:cs="Neucha" w:eastAsia="Neucha"/>
+                <w:rFonts w:ascii="IBM Plex Sans SemiBold" w:hAnsi="IBM Plex Sans SemiBold" w:cs="IBM Plex Sans SemiBold" w:eastAsia="IBM Plex Sans SemiBold"/>
                 <w:b w:val="0"/>
                 <w:i w:val="0"/>
                 <w:color w:val="1E4D7B"/>
-                <w:sz w:val="24"/>
+                <w:sz w:val="22"/>
               </w:rPr>
               <w:t>Втроём</w:t>
             </w:r>
@@ -2541,11 +2495,11 @@
             </w:pPr>
             <w:r>
               <w:rPr>
-                <w:rFonts w:ascii="Neucha" w:hAnsi="Neucha" w:cs="Neucha" w:eastAsia="Neucha"/>
+                <w:rFonts w:ascii="IBM Plex Sans" w:hAnsi="IBM Plex Sans" w:cs="IBM Plex Sans" w:eastAsia="IBM Plex Sans"/>
                 <w:b w:val="0"/>
                 <w:i w:val="0"/>
                 <w:color w:val="2A2622"/>
-                <w:sz w:val="24"/>
+                <w:sz w:val="22"/>
               </w:rPr>
               <w:t>Вэлью только с сильной готовой. Блеф почти никогда.</w:t>
             </w:r>
@@ -2560,40 +2514,40 @@
     </w:p>
     <w:p>
       <w:pPr>
-        <w:spacing w:before="40" w:after="16" w:line="226" w:lineRule="auto"/>
+        <w:spacing w:before="80" w:after="20" w:line="252" w:lineRule="auto"/>
       </w:pPr>
       <w:r>
         <w:rPr>
-          <w:rFonts w:ascii="Neucha" w:hAnsi="Neucha" w:cs="Neucha" w:eastAsia="Neucha"/>
+          <w:rFonts w:ascii="IBM Plex Sans SemiBold" w:hAnsi="IBM Plex Sans SemiBold" w:cs="IBM Plex Sans SemiBold" w:eastAsia="IBM Plex Sans SemiBold"/>
           <w:b w:val="0"/>
           <w:i w:val="0"/>
           <w:color w:val="B94A3E"/>
-          <w:sz w:val="32"/>
+          <w:sz w:val="28"/>
         </w:rPr>
         <w:t xml:space="preserve">8   </w:t>
       </w:r>
       <w:r>
         <w:rPr>
-          <w:rFonts w:ascii="Neucha" w:hAnsi="Neucha" w:cs="Neucha" w:eastAsia="Neucha"/>
+          <w:rFonts w:ascii="IBM Plex Sans SemiBold" w:hAnsi="IBM Plex Sans SemiBold" w:cs="IBM Plex Sans SemiBold" w:eastAsia="IBM Plex Sans SemiBold"/>
           <w:b w:val="0"/>
           <w:i w:val="0"/>
           <w:color w:val="2A2622"/>
-          <w:sz w:val="32"/>
+          <w:sz w:val="28"/>
         </w:rPr>
         <w:t>Тёрн и ривер</w:t>
       </w:r>
     </w:p>
     <w:p>
       <w:pPr>
-        <w:spacing w:before="0" w:after="40" w:line="226" w:lineRule="auto"/>
+        <w:spacing w:before="0" w:after="40" w:line="252" w:lineRule="auto"/>
       </w:pPr>
       <w:r>
         <w:rPr>
-          <w:rFonts w:ascii="Neucha" w:hAnsi="Neucha" w:cs="Neucha" w:eastAsia="Neucha"/>
+          <w:rFonts w:ascii="IBM Plex Sans" w:hAnsi="IBM Plex Sans" w:cs="IBM Plex Sans" w:eastAsia="IBM Plex Sans"/>
           <w:b w:val="0"/>
           <w:i w:val="0"/>
           <w:color w:val="2A2622"/>
-          <w:sz w:val="28"/>
+          <w:sz w:val="24"/>
         </w:rPr>
         <w:t>Одна новая карта. Линию заново не выдумывай.</w:t>
       </w:r>
@@ -2637,11 +2591,11 @@
             </w:pPr>
             <w:r>
               <w:rPr>
-                <w:rFonts w:ascii="Neucha" w:hAnsi="Neucha" w:cs="Neucha" w:eastAsia="Neucha"/>
+                <w:rFonts w:ascii="IBM Plex Sans SemiBold" w:hAnsi="IBM Plex Sans SemiBold" w:cs="IBM Plex Sans SemiBold" w:eastAsia="IBM Plex Sans SemiBold"/>
                 <w:b w:val="0"/>
                 <w:i w:val="0"/>
                 <w:color w:val="1E4D7B"/>
-                <w:sz w:val="24"/>
+                <w:sz w:val="22"/>
               </w:rPr>
               <w:t>Дро закрылось</w:t>
             </w:r>
@@ -2663,11 +2617,11 @@
             </w:pPr>
             <w:r>
               <w:rPr>
-                <w:rFonts w:ascii="Neucha" w:hAnsi="Neucha" w:cs="Neucha" w:eastAsia="Neucha"/>
+                <w:rFonts w:ascii="IBM Plex Sans" w:hAnsi="IBM Plex Sans" w:cs="IBM Plex Sans" w:eastAsia="IBM Plex Sans"/>
                 <w:b w:val="0"/>
                 <w:i w:val="0"/>
                 <w:color w:val="2A2622"/>
-                <w:sz w:val="24"/>
+                <w:sz w:val="22"/>
               </w:rPr>
               <w:t>Теперь это готовая рука. Шаг 7: вэлью или чек.</w:t>
             </w:r>
@@ -2695,11 +2649,11 @@
             </w:pPr>
             <w:r>
               <w:rPr>
-                <w:rFonts w:ascii="Neucha" w:hAnsi="Neucha" w:cs="Neucha" w:eastAsia="Neucha"/>
+                <w:rFonts w:ascii="IBM Plex Sans SemiBold" w:hAnsi="IBM Plex Sans SemiBold" w:cs="IBM Plex Sans SemiBold" w:eastAsia="IBM Plex Sans SemiBold"/>
                 <w:b w:val="0"/>
                 <w:i w:val="0"/>
                 <w:color w:val="1E4D7B"/>
-                <w:sz w:val="24"/>
+                <w:sz w:val="22"/>
               </w:rPr>
               <w:t>Не закрылось</w:t>
             </w:r>
@@ -2721,11 +2675,11 @@
             </w:pPr>
             <w:r>
               <w:rPr>
-                <w:rFonts w:ascii="Neucha" w:hAnsi="Neucha" w:cs="Neucha" w:eastAsia="Neucha"/>
+                <w:rFonts w:ascii="IBM Plex Sans" w:hAnsi="IBM Plex Sans" w:cs="IBM Plex Sans" w:eastAsia="IBM Plex Sans"/>
                 <w:b w:val="0"/>
                 <w:i w:val="0"/>
                 <w:color w:val="2A2622"/>
-                <w:sz w:val="24"/>
+                <w:sz w:val="22"/>
               </w:rPr>
               <w:t>Ауты заново, уже ×2. Цену заново. Дорого — фолд.</w:t>
             </w:r>
@@ -2753,11 +2707,11 @@
             </w:pPr>
             <w:r>
               <w:rPr>
-                <w:rFonts w:ascii="Neucha" w:hAnsi="Neucha" w:cs="Neucha" w:eastAsia="Neucha"/>
+                <w:rFonts w:ascii="IBM Plex Sans SemiBold" w:hAnsi="IBM Plex Sans SemiBold" w:cs="IBM Plex Sans SemiBold" w:eastAsia="IBM Plex Sans SemiBold"/>
                 <w:b w:val="0"/>
                 <w:i w:val="0"/>
                 <w:color w:val="1E4D7B"/>
-                <w:sz w:val="24"/>
+                <w:sz w:val="22"/>
               </w:rPr>
               <w:t>Ривер</w:t>
             </w:r>
@@ -2779,11 +2733,11 @@
             </w:pPr>
             <w:r>
               <w:rPr>
-                <w:rFonts w:ascii="Neucha" w:hAnsi="Neucha" w:cs="Neucha" w:eastAsia="Neucha"/>
+                <w:rFonts w:ascii="IBM Plex Sans" w:hAnsi="IBM Plex Sans" w:cs="IBM Plex Sans" w:eastAsia="IBM Plex Sans"/>
                 <w:b w:val="0"/>
                 <w:i w:val="0"/>
                 <w:color w:val="2A2622"/>
-                <w:sz w:val="24"/>
+                <w:sz w:val="22"/>
               </w:rPr>
               <w:t>Дро умерло. Осталась готовая рука. Вэлью или чек. Блеф на ривере в спине редкий: лучше руки часто не сбрасывают.</w:t>
             </w:r>
@@ -2803,291 +2757,291 @@
     </w:p>
     <w:p>
       <w:pPr>
-        <w:spacing w:before="0" w:after="0" w:line="226" w:lineRule="auto"/>
+        <w:spacing w:before="0" w:after="0" w:line="240" w:lineRule="auto"/>
       </w:pPr>
       <w:r>
         <w:rPr>
-          <w:rFonts w:ascii="Neucha" w:hAnsi="Neucha" w:cs="Neucha" w:eastAsia="Neucha"/>
+          <w:rFonts w:ascii="IBM Plex Sans SemiBold" w:hAnsi="IBM Plex Sans SemiBold" w:cs="IBM Plex Sans SemiBold" w:eastAsia="IBM Plex Sans SemiBold"/>
           <w:b w:val="0"/>
           <w:i w:val="0"/>
           <w:color w:val="2A2622"/>
-          <w:sz w:val="52"/>
+          <w:sz w:val="44"/>
         </w:rPr>
         <w:t>Держи перед глазами</w:t>
       </w:r>
     </w:p>
     <w:p>
       <w:pPr>
-        <w:spacing w:before="0" w:after="50" w:line="226" w:lineRule="auto"/>
+        <w:spacing w:before="0" w:after="60" w:line="252" w:lineRule="auto"/>
       </w:pPr>
       <w:r>
         <w:rPr>
-          <w:rFonts w:ascii="Neucha" w:hAnsi="Neucha" w:cs="Neucha" w:eastAsia="Neucha"/>
+          <w:rFonts w:ascii="IBM Plex Sans" w:hAnsi="IBM Plex Sans" w:cs="IBM Plex Sans" w:eastAsia="IBM Plex Sans"/>
           <w:b w:val="0"/>
           <w:i w:val="0"/>
           <w:color w:val="5C564E"/>
-          <w:sz w:val="26"/>
+          <w:sz w:val="24"/>
         </w:rPr>
         <w:t>Восемь строк. Остальное — пояснение, не во время раздачи.</w:t>
       </w:r>
     </w:p>
     <w:p>
       <w:pPr>
-        <w:spacing w:before="0" w:after="50" w:line="230" w:lineRule="auto"/>
+        <w:spacing w:before="0" w:after="36" w:line="246" w:lineRule="auto"/>
       </w:pPr>
       <w:r>
         <w:rPr>
-          <w:rFonts w:ascii="Neucha" w:hAnsi="Neucha" w:cs="Neucha" w:eastAsia="Neucha"/>
+          <w:rFonts w:ascii="IBM Plex Sans" w:hAnsi="IBM Plex Sans" w:cs="IBM Plex Sans" w:eastAsia="IBM Plex Sans"/>
           <w:b w:val="0"/>
           <w:i w:val="0"/>
           <w:color w:val="2A2622"/>
-          <w:sz w:val="28"/>
+          <w:sz w:val="24"/>
         </w:rPr>
         <w:t>1   Позиция, кто в банке, стек. Трое или двое. 15bb или меньше.</w:t>
       </w:r>
     </w:p>
     <w:p>
       <w:pPr>
-        <w:spacing w:before="0" w:after="50" w:line="230" w:lineRule="auto"/>
+        <w:spacing w:before="0" w:after="36" w:line="246" w:lineRule="auto"/>
       </w:pPr>
       <w:r>
         <w:rPr>
-          <w:rFonts w:ascii="Neucha" w:hAnsi="Neucha" w:cs="Neucha" w:eastAsia="Neucha"/>
+          <w:rFonts w:ascii="IBM Plex Sans" w:hAnsi="IBM Plex Sans" w:cs="IBM Plex Sans" w:eastAsia="IBM Plex Sans"/>
           <w:b w:val="0"/>
           <w:i w:val="0"/>
           <w:color w:val="2A2622"/>
-          <w:sz w:val="28"/>
+          <w:sz w:val="24"/>
         </w:rPr>
         <w:t>2   Какой спот. Какой чарт. Рука — клетка, не ощущение.</w:t>
       </w:r>
     </w:p>
     <w:p>
       <w:pPr>
-        <w:spacing w:before="0" w:after="50" w:line="230" w:lineRule="auto"/>
+        <w:spacing w:before="0" w:after="36" w:line="246" w:lineRule="auto"/>
       </w:pPr>
       <w:r>
         <w:rPr>
-          <w:rFonts w:ascii="Neucha" w:hAnsi="Neucha" w:cs="Neucha" w:eastAsia="Neucha"/>
+          <w:rFonts w:ascii="IBM Plex Sans" w:hAnsi="IBM Plex Sans" w:cs="IBM Plex Sans" w:eastAsia="IBM Plex Sans"/>
           <w:b w:val="0"/>
           <w:i w:val="0"/>
           <w:color w:val="2A2622"/>
-          <w:sz w:val="28"/>
+          <w:sz w:val="24"/>
         </w:rPr>
         <w:t>3   Действие и размер из чарта. Микс — частое. Пуш — только колл или фолд, нужно ~47%.</w:t>
       </w:r>
     </w:p>
     <w:p>
       <w:pPr>
-        <w:spacing w:before="0" w:after="50" w:line="230" w:lineRule="auto"/>
+        <w:spacing w:before="0" w:after="36" w:line="246" w:lineRule="auto"/>
       </w:pPr>
       <w:r>
         <w:rPr>
-          <w:rFonts w:ascii="Neucha" w:hAnsi="Neucha" w:cs="Neucha" w:eastAsia="Neucha"/>
+          <w:rFonts w:ascii="IBM Plex Sans" w:hAnsi="IBM Plex Sans" w:cs="IBM Plex Sans" w:eastAsia="IBM Plex Sans"/>
           <w:b w:val="0"/>
           <w:i w:val="0"/>
           <w:color w:val="2A2622"/>
-          <w:sz w:val="28"/>
+          <w:sz w:val="24"/>
         </w:rPr>
         <w:t>4   Ответ: фолд, колл и флоп, рейз (шаг 2) или пуш (шаг 2, без борда).</w:t>
       </w:r>
     </w:p>
     <w:p>
       <w:pPr>
-        <w:spacing w:before="0" w:after="50" w:line="230" w:lineRule="auto"/>
+        <w:spacing w:before="0" w:after="36" w:line="246" w:lineRule="auto"/>
       </w:pPr>
       <w:r>
         <w:rPr>
-          <w:rFonts w:ascii="Neucha" w:hAnsi="Neucha" w:cs="Neucha" w:eastAsia="Neucha"/>
+          <w:rFonts w:ascii="IBM Plex Sans" w:hAnsi="IBM Plex Sans" w:cs="IBM Plex Sans" w:eastAsia="IBM Plex Sans"/>
           <w:b w:val="0"/>
           <w:i w:val="0"/>
           <w:color w:val="2A2622"/>
-          <w:sz w:val="28"/>
+          <w:sz w:val="24"/>
         </w:rPr>
         <w:t>5   Флоп: один или двое, SPR, доска одной фразой, класс руки.</w:t>
       </w:r>
     </w:p>
     <w:p>
       <w:pPr>
-        <w:spacing w:before="0" w:after="50" w:line="230" w:lineRule="auto"/>
+        <w:spacing w:before="0" w:after="36" w:line="246" w:lineRule="auto"/>
       </w:pPr>
       <w:r>
         <w:rPr>
-          <w:rFonts w:ascii="Neucha" w:hAnsi="Neucha" w:cs="Neucha" w:eastAsia="Neucha"/>
+          <w:rFonts w:ascii="IBM Plex Sans" w:hAnsi="IBM Plex Sans" w:cs="IBM Plex Sans" w:eastAsia="IBM Plex Sans"/>
           <w:b w:val="0"/>
           <w:i w:val="0"/>
           <w:color w:val="2A2622"/>
-          <w:sz w:val="28"/>
+          <w:sz w:val="24"/>
         </w:rPr>
         <w:t>6   Чистые ауты ×4 или ×2. Цена = доплатить / банк после колла. Сравни.</w:t>
       </w:r>
     </w:p>
     <w:p>
       <w:pPr>
-        <w:spacing w:before="0" w:after="50" w:line="230" w:lineRule="auto"/>
+        <w:spacing w:before="0" w:after="36" w:line="246" w:lineRule="auto"/>
       </w:pPr>
       <w:r>
         <w:rPr>
-          <w:rFonts w:ascii="Neucha" w:hAnsi="Neucha" w:cs="Neucha" w:eastAsia="Neucha"/>
+          <w:rFonts w:ascii="IBM Plex Sans" w:hAnsi="IBM Plex Sans" w:cs="IBM Plex Sans" w:eastAsia="IBM Plex Sans"/>
           <w:b w:val="0"/>
           <w:i w:val="0"/>
           <w:color w:val="2A2622"/>
-          <w:sz w:val="28"/>
+          <w:sz w:val="24"/>
         </w:rPr>
         <w:t>7   Ставка только вэлью или только блеф. Иначе чек. SPR ≤ 1 — пуш или фолд.</w:t>
       </w:r>
     </w:p>
     <w:p>
       <w:pPr>
-        <w:spacing w:before="0" w:after="50" w:line="230" w:lineRule="auto"/>
+        <w:spacing w:before="0" w:after="36" w:line="246" w:lineRule="auto"/>
       </w:pPr>
       <w:r>
         <w:rPr>
-          <w:rFonts w:ascii="Neucha" w:hAnsi="Neucha" w:cs="Neucha" w:eastAsia="Neucha"/>
+          <w:rFonts w:ascii="IBM Plex Sans" w:hAnsi="IBM Plex Sans" w:cs="IBM Plex Sans" w:eastAsia="IBM Plex Sans"/>
           <w:b w:val="0"/>
           <w:i w:val="0"/>
           <w:color w:val="2A2622"/>
-          <w:sz w:val="28"/>
+          <w:sz w:val="24"/>
         </w:rPr>
         <w:t>8   Тёрн и ривер: пересчитай ауты и цену. Не оплачивай улицу без цены.</w:t>
       </w:r>
     </w:p>
     <w:p>
       <w:pPr>
-        <w:spacing w:before="80" w:after="30" w:line="220" w:lineRule="auto"/>
+        <w:spacing w:before="100" w:after="40" w:line="240" w:lineRule="auto"/>
         <w:pBdr>
           <w:bottom w:val="single" w:sz="8" w:space="1" w:color="B94A3E"/>
         </w:pBdr>
       </w:pPr>
       <w:r>
         <w:rPr>
-          <w:rFonts w:ascii="Neucha" w:hAnsi="Neucha" w:cs="Neucha" w:eastAsia="Neucha"/>
+          <w:rFonts w:ascii="IBM Plex Sans SemiBold" w:hAnsi="IBM Plex Sans SemiBold" w:cs="IBM Plex Sans SemiBold" w:eastAsia="IBM Plex Sans SemiBold"/>
           <w:b w:val="0"/>
           <w:i w:val="0"/>
           <w:color w:val="B94A3E"/>
-          <w:sz w:val="36"/>
+          <w:sz w:val="28"/>
         </w:rPr>
         <w:t>Не делать</w:t>
       </w:r>
     </w:p>
     <w:p>
       <w:pPr>
-        <w:spacing w:before="0" w:after="20" w:line="226" w:lineRule="auto"/>
+        <w:spacing w:before="0" w:after="16" w:line="252" w:lineRule="auto"/>
       </w:pPr>
       <w:r>
         <w:rPr>
-          <w:rFonts w:ascii="Neucha" w:hAnsi="Neucha" w:cs="Neucha" w:eastAsia="Neucha"/>
+          <w:rFonts w:ascii="IBM Plex Sans" w:hAnsi="IBM Plex Sans" w:cs="IBM Plex Sans" w:eastAsia="IBM Plex Sans"/>
           <w:b w:val="0"/>
           <w:i w:val="0"/>
           <w:color w:val="2A2622"/>
-          <w:sz w:val="26"/>
+          <w:sz w:val="24"/>
         </w:rPr>
         <w:t>—  Калькулятор и солвер, пока раздача идёт.</w:t>
       </w:r>
     </w:p>
     <w:p>
       <w:pPr>
-        <w:spacing w:before="0" w:after="20" w:line="226" w:lineRule="auto"/>
+        <w:spacing w:before="0" w:after="16" w:line="252" w:lineRule="auto"/>
       </w:pPr>
       <w:r>
         <w:rPr>
-          <w:rFonts w:ascii="Neucha" w:hAnsi="Neucha" w:cs="Neucha" w:eastAsia="Neucha"/>
+          <w:rFonts w:ascii="IBM Plex Sans" w:hAnsi="IBM Plex Sans" w:cs="IBM Plex Sans" w:eastAsia="IBM Plex Sans"/>
           <w:b w:val="0"/>
           <w:i w:val="0"/>
           <w:color w:val="2A2622"/>
-          <w:sz w:val="26"/>
+          <w:sz w:val="24"/>
         </w:rPr>
         <w:t>—  Лимп с баттона.</w:t>
       </w:r>
     </w:p>
     <w:p>
       <w:pPr>
-        <w:spacing w:before="0" w:after="20" w:line="226" w:lineRule="auto"/>
+        <w:spacing w:before="0" w:after="16" w:line="252" w:lineRule="auto"/>
       </w:pPr>
       <w:r>
         <w:rPr>
-          <w:rFonts w:ascii="Neucha" w:hAnsi="Neucha" w:cs="Neucha" w:eastAsia="Neucha"/>
+          <w:rFonts w:ascii="IBM Plex Sans" w:hAnsi="IBM Plex Sans" w:cs="IBM Plex Sans" w:eastAsia="IBM Plex Sans"/>
           <w:b w:val="0"/>
           <w:i w:val="0"/>
           <w:color w:val="2A2622"/>
-          <w:sz w:val="26"/>
+          <w:sz w:val="24"/>
         </w:rPr>
         <w:t>—  Колл пуша «потому что туз», если рука слабее якоря.</w:t>
       </w:r>
     </w:p>
     <w:p>
       <w:pPr>
-        <w:spacing w:before="0" w:after="20" w:line="226" w:lineRule="auto"/>
+        <w:spacing w:before="0" w:after="16" w:line="252" w:lineRule="auto"/>
       </w:pPr>
       <w:r>
         <w:rPr>
-          <w:rFonts w:ascii="Neucha" w:hAnsi="Neucha" w:cs="Neucha" w:eastAsia="Neucha"/>
+          <w:rFonts w:ascii="IBM Plex Sans" w:hAnsi="IBM Plex Sans" w:cs="IBM Plex Sans" w:eastAsia="IBM Plex Sans"/>
           <w:b w:val="0"/>
           <w:i w:val="0"/>
           <w:color w:val="2A2622"/>
-          <w:sz w:val="26"/>
+          <w:sz w:val="24"/>
         </w:rPr>
         <w:t>—  Дорогой гатшот. Четыре аута — это около 16%.</w:t>
       </w:r>
     </w:p>
     <w:p>
       <w:pPr>
-        <w:spacing w:before="0" w:after="20" w:line="226" w:lineRule="auto"/>
+        <w:spacing w:before="0" w:after="16" w:line="252" w:lineRule="auto"/>
       </w:pPr>
       <w:r>
         <w:rPr>
-          <w:rFonts w:ascii="Neucha" w:hAnsi="Neucha" w:cs="Neucha" w:eastAsia="Neucha"/>
+          <w:rFonts w:ascii="IBM Plex Sans" w:hAnsi="IBM Plex Sans" w:cs="IBM Plex Sans" w:eastAsia="IBM Plex Sans"/>
           <w:b w:val="0"/>
           <w:i w:val="0"/>
           <w:color w:val="2A2622"/>
-          <w:sz w:val="26"/>
+          <w:sz w:val="24"/>
         </w:rPr>
         <w:t>—  Блеф, когда в банке двое соперников.</w:t>
       </w:r>
     </w:p>
     <w:p>
       <w:pPr>
-        <w:spacing w:before="0" w:after="20" w:line="226" w:lineRule="auto"/>
+        <w:spacing w:before="0" w:after="16" w:line="252" w:lineRule="auto"/>
       </w:pPr>
       <w:r>
         <w:rPr>
-          <w:rFonts w:ascii="Neucha" w:hAnsi="Neucha" w:cs="Neucha" w:eastAsia="Neucha"/>
+          <w:rFonts w:ascii="IBM Plex Sans" w:hAnsi="IBM Plex Sans" w:cs="IBM Plex Sans" w:eastAsia="IBM Plex Sans"/>
           <w:b w:val="0"/>
           <w:i w:val="0"/>
           <w:color w:val="2A2622"/>
-          <w:sz w:val="26"/>
+          <w:sz w:val="24"/>
         </w:rPr>
         <w:t>—  Мелкий колл, если на следующей улице всё равно сбросишь.</w:t>
       </w:r>
     </w:p>
     <w:p>
       <w:pPr>
-        <w:spacing w:before="80" w:after="30" w:line="220" w:lineRule="auto"/>
+        <w:spacing w:before="100" w:after="40" w:line="240" w:lineRule="auto"/>
         <w:pBdr>
           <w:bottom w:val="single" w:sz="8" w:space="1" w:color="1E4D7B"/>
         </w:pBdr>
       </w:pPr>
       <w:r>
         <w:rPr>
-          <w:rFonts w:ascii="Neucha" w:hAnsi="Neucha" w:cs="Neucha" w:eastAsia="Neucha"/>
+          <w:rFonts w:ascii="IBM Plex Sans SemiBold" w:hAnsi="IBM Plex Sans SemiBold" w:cs="IBM Plex Sans SemiBold" w:eastAsia="IBM Plex Sans SemiBold"/>
           <w:b w:val="0"/>
           <w:i w:val="0"/>
           <w:color w:val="1E4D7B"/>
-          <w:sz w:val="36"/>
+          <w:sz w:val="28"/>
         </w:rPr>
         <w:t>Между раздачами, одна спорная</w:t>
       </w:r>
     </w:p>
     <w:p>
       <w:pPr>
-        <w:spacing w:before="0" w:after="30" w:line="226" w:lineRule="auto"/>
+        <w:spacing w:before="0" w:after="30" w:line="252" w:lineRule="auto"/>
       </w:pPr>
       <w:r>
         <w:rPr>
-          <w:rFonts w:ascii="Neucha" w:hAnsi="Neucha" w:cs="Neucha" w:eastAsia="Neucha"/>
+          <w:rFonts w:ascii="IBM Plex Sans" w:hAnsi="IBM Plex Sans" w:cs="IBM Plex Sans" w:eastAsia="IBM Plex Sans"/>
           <w:b w:val="0"/>
           <w:i w:val="0"/>
           <w:color w:val="5C564E"/>
-          <w:sz w:val="24"/>
+          <w:sz w:val="22"/>
         </w:rPr>
         <w:t>Не десять. Одну. После сессии проверь её в тренажёре, не в калькуляторе за столом.</w:t>
       </w:r>
@@ -3101,11 +3055,11 @@
       </w:pPr>
       <w:r>
         <w:rPr>
-          <w:rFonts w:ascii="Neucha" w:hAnsi="Neucha" w:cs="Neucha" w:eastAsia="Neucha"/>
+          <w:rFonts w:ascii="IBM Plex Sans" w:hAnsi="IBM Plex Sans" w:cs="IBM Plex Sans" w:eastAsia="IBM Plex Sans"/>
           <w:b w:val="0"/>
           <w:i w:val="0"/>
           <w:color w:val="5C564E"/>
-          <w:sz w:val="26"/>
+          <w:sz w:val="24"/>
         </w:rPr>
         <w:t>Рука</w:t>
       </w:r>
@@ -3119,11 +3073,11 @@
       </w:pPr>
       <w:r>
         <w:rPr>
-          <w:rFonts w:ascii="Neucha" w:hAnsi="Neucha" w:cs="Neucha" w:eastAsia="Neucha"/>
+          <w:rFonts w:ascii="IBM Plex Sans" w:hAnsi="IBM Plex Sans" w:cs="IBM Plex Sans" w:eastAsia="IBM Plex Sans"/>
           <w:b w:val="0"/>
           <w:i w:val="0"/>
           <w:color w:val="5C564E"/>
-          <w:sz w:val="26"/>
+          <w:sz w:val="24"/>
         </w:rPr>
         <w:t>Спот или борд</w:t>
       </w:r>
@@ -3137,11 +3091,11 @@
       </w:pPr>
       <w:r>
         <w:rPr>
-          <w:rFonts w:ascii="Neucha" w:hAnsi="Neucha" w:cs="Neucha" w:eastAsia="Neucha"/>
+          <w:rFonts w:ascii="IBM Plex Sans" w:hAnsi="IBM Plex Sans" w:cs="IBM Plex Sans" w:eastAsia="IBM Plex Sans"/>
           <w:b w:val="0"/>
           <w:i w:val="0"/>
           <w:color w:val="5C564E"/>
-          <w:sz w:val="26"/>
+          <w:sz w:val="24"/>
         </w:rPr>
         <w:t>Что сделал</w:t>
       </w:r>
@@ -3155,11 +3109,11 @@
       </w:pPr>
       <w:r>
         <w:rPr>
-          <w:rFonts w:ascii="Neucha" w:hAnsi="Neucha" w:cs="Neucha" w:eastAsia="Neucha"/>
+          <w:rFonts w:ascii="IBM Plex Sans" w:hAnsi="IBM Plex Sans" w:cs="IBM Plex Sans" w:eastAsia="IBM Plex Sans"/>
           <w:b w:val="0"/>
           <w:i w:val="0"/>
           <w:color w:val="5C564E"/>
-          <w:sz w:val="26"/>
+          <w:sz w:val="24"/>
         </w:rPr>
         <w:t>Какой шаг нарушил</w:t>
       </w:r>
@@ -3173,11 +3127,11 @@
       </w:pPr>
       <w:r>
         <w:rPr>
-          <w:rFonts w:ascii="Neucha" w:hAnsi="Neucha" w:cs="Neucha" w:eastAsia="Neucha"/>
+          <w:rFonts w:ascii="IBM Plex Sans" w:hAnsi="IBM Plex Sans" w:cs="IBM Plex Sans" w:eastAsia="IBM Plex Sans"/>
           <w:b w:val="0"/>
           <w:i w:val="0"/>
           <w:color w:val="5C564E"/>
-          <w:sz w:val="26"/>
+          <w:sz w:val="24"/>
         </w:rPr>
         <w:t>Что надо было</w:t>
       </w:r>
@@ -3205,7 +3159,7 @@
     </w:pPr>
     <w:r>
       <w:rPr>
-        <w:rFonts w:ascii="Neucha" w:hAnsi="Neucha" w:cs="Neucha" w:eastAsia="Neucha"/>
+        <w:rFonts w:ascii="IBM Plex Sans" w:hAnsi="IBM Plex Sans" w:cs="IBM Plex Sans" w:eastAsia="IBM Plex Sans"/>
         <w:b w:val="0"/>
         <w:i w:val="0"/>
         <w:color w:val="5C564E"/>
@@ -3581,7 +3535,7 @@
     <w:qFormat/>
     <w:rsid w:val="00FC693F"/>
     <w:rPr>
-      <w:rFonts w:ascii="Neucha" w:hAnsi="Neucha" w:cs="Neucha" w:eastAsia="Neucha"/>
+      <w:rFonts w:ascii="IBM Plex Sans" w:hAnsi="IBM Plex Sans" w:cs="IBM Plex Sans" w:eastAsia="IBM Plex Sans"/>
       <w:sz w:val="26"/>
     </w:rPr>
   </w:style>

</xml_diff>